<commit_message>
ayos na yung di makatype sa log in tyaka pag register
</commit_message>
<xml_diff>
--- a/AZURES_PROPOSAL.docx
+++ b/AZURES_PROPOSAL.docx
@@ -103,15 +103,7 @@
     </w:p>
     <w:p>
       <w:r>
-        <w:t xml:space="preserve">Mainstream social networking platforms like Facebook and public forums host an overwhelming amount of general clutter, algorithmic noise, commercial advertisements, and external traffic. </w:t>
-      </w:r>
-      <w:proofErr w:type="gramStart"/>
-      <w:r>
-        <w:t>As a consequence</w:t>
-      </w:r>
-      <w:proofErr w:type="gramEnd"/>
-      <w:r>
-        <w:t xml:space="preserve">, Adamson University students struggle to locate urgent campus announcements, college-specific academic discussions, student organization notices, and lost-and-found reports. </w:t>
+        <w:t xml:space="preserve">Mainstream social networking platforms like Facebook and public forums host an overwhelming amount of general clutter, algorithmic noise, commercial advertisements, and external traffic. As a consequence, Adamson University students struggle to locate urgent campus announcements, college-specific academic discussions, student organization notices, and lost-and-found reports. </w:t>
       </w:r>
     </w:p>
     <w:p>
@@ -1026,15 +1018,37 @@
     <w:p>
       <w:r>
         <w:br/>
+      </w:r>
+    </w:p>
+    <w:p/>
+    <w:p/>
+    <w:p/>
+    <w:p/>
+    <w:p/>
+    <w:p/>
+    <w:p/>
+    <w:p/>
+    <w:p/>
+    <w:p/>
+    <w:p/>
+    <w:p/>
+    <w:p/>
+    <w:p/>
+    <w:p/>
+    <w:p>
+      <w:r>
+        <w:lastRenderedPageBreak/>
         <w:t>ERD:</w:t>
       </w:r>
     </w:p>
     <w:p>
       <w:r>
-        <w:lastRenderedPageBreak/>
         <w:br/>
       </w:r>
       <w:r>
+        <w:rPr>
+          <w:noProof/>
+        </w:rPr>
         <w:drawing>
           <wp:inline distT="0" distB="0" distL="0" distR="0" wp14:anchorId="35613EE5" wp14:editId="6EB69F45">
             <wp:extent cx="4503810" cy="4770533"/>
@@ -1078,10 +1092,7 @@
         <w:ind w:firstLine="720"/>
       </w:pPr>
       <w:r>
-        <w:t>My application</w:t>
-      </w:r>
-      <w:r>
-        <w:t xml:space="preserve"> follows a One-to-Many (1:M) relational schema between the USER and CAMPUS_POST entities. A student is uniquely identified by their </w:t>
+        <w:t xml:space="preserve">My application follows a One-to-Many (1:M) relational schema between the USER and CAMPUS_POST entities. A student is uniquely identified by their </w:t>
       </w:r>
       <w:proofErr w:type="spellStart"/>
       <w:r>
@@ -1099,6 +1110,228 @@
       <w:r>
         <w:t xml:space="preserve"> as a Foreign Key. This ensures that every post in the feed and user profile traces back to its author while allowing any single student to publish multiple posts across various campus categories.</w:t>
       </w:r>
+      <w:r>
+        <w:br/>
+      </w:r>
+      <w:r>
+        <w:br/>
+        <w:t>UPDATED ERD:</w:t>
+      </w:r>
+      <w:r>
+        <w:br/>
+      </w:r>
+      <w:r>
+        <w:lastRenderedPageBreak/>
+        <w:br/>
+      </w:r>
+      <w:r>
+        <w:rPr>
+          <w:noProof/>
+        </w:rPr>
+        <w:drawing>
+          <wp:inline distT="0" distB="0" distL="0" distR="0" wp14:anchorId="70EA1335" wp14:editId="0BDDC738">
+            <wp:extent cx="5943600" cy="5165725"/>
+            <wp:effectExtent l="0" t="0" r="0" b="0"/>
+            <wp:docPr id="362315699" name="Picture 1"/>
+            <wp:cNvGraphicFramePr>
+              <a:graphicFrameLocks xmlns:a="http://schemas.openxmlformats.org/drawingml/2006/main" noChangeAspect="1"/>
+            </wp:cNvGraphicFramePr>
+            <a:graphic xmlns:a="http://schemas.openxmlformats.org/drawingml/2006/main">
+              <a:graphicData uri="http://schemas.openxmlformats.org/drawingml/2006/picture">
+                <pic:pic xmlns:pic="http://schemas.openxmlformats.org/drawingml/2006/picture">
+                  <pic:nvPicPr>
+                    <pic:cNvPr id="362315699" name=""/>
+                    <pic:cNvPicPr/>
+                  </pic:nvPicPr>
+                  <pic:blipFill>
+                    <a:blip r:embed="rId6"/>
+                    <a:stretch>
+                      <a:fillRect/>
+                    </a:stretch>
+                  </pic:blipFill>
+                  <pic:spPr>
+                    <a:xfrm>
+                      <a:off x="0" y="0"/>
+                      <a:ext cx="5943600" cy="5165725"/>
+                    </a:xfrm>
+                    <a:prstGeom prst="rect">
+                      <a:avLst/>
+                    </a:prstGeom>
+                  </pic:spPr>
+                </pic:pic>
+              </a:graphicData>
+            </a:graphic>
+          </wp:inline>
+        </w:drawing>
+      </w:r>
+    </w:p>
+    <w:p>
+      <w:pPr>
+        <w:ind w:firstLine="720"/>
+      </w:pPr>
+    </w:p>
+    <w:p>
+      <w:pPr>
+        <w:ind w:firstLine="720"/>
+      </w:pPr>
+      <w:r>
+        <w:t>This ERD illustrates a One-to-Many (</w:t>
+      </w:r>
+      <m:oMath>
+        <m:r>
+          <w:rPr>
+            <w:rFonts w:ascii="Cambria Math" w:hAnsi="Cambria Math"/>
+          </w:rPr>
+          <m:t>1:M</m:t>
+        </m:r>
+      </m:oMath>
+      <w:r>
+        <w:t>) relational architecture where a central USER entity authors CAMPUS_POST entries, posts comments (COMMENT), and curates personal saved items (BOOKMARK), maintaining relational integrity through Primary and Foreign Key references.</w:t>
+      </w:r>
+    </w:p>
+    <w:p>
+      <w:pPr>
+        <w:ind w:firstLine="720"/>
+      </w:pPr>
+    </w:p>
+    <w:p>
+      <w:pPr>
+        <w:ind w:firstLine="720"/>
+      </w:pPr>
+      <w:r>
+        <w:t>UPDATED FIREBASE ERD</w:t>
+      </w:r>
+    </w:p>
+    <w:p>
+      <w:pPr>
+        <w:ind w:firstLine="720"/>
+      </w:pPr>
+      <w:r>
+        <w:rPr>
+          <w:noProof/>
+        </w:rPr>
+        <w:lastRenderedPageBreak/>
+        <w:drawing>
+          <wp:inline distT="0" distB="0" distL="0" distR="0" wp14:anchorId="3B705301" wp14:editId="58D664C8">
+            <wp:extent cx="5943600" cy="5158740"/>
+            <wp:effectExtent l="0" t="0" r="0" b="3810"/>
+            <wp:docPr id="1627815848" name="Picture 1"/>
+            <wp:cNvGraphicFramePr>
+              <a:graphicFrameLocks xmlns:a="http://schemas.openxmlformats.org/drawingml/2006/main" noChangeAspect="1"/>
+            </wp:cNvGraphicFramePr>
+            <a:graphic xmlns:a="http://schemas.openxmlformats.org/drawingml/2006/main">
+              <a:graphicData uri="http://schemas.openxmlformats.org/drawingml/2006/picture">
+                <pic:pic xmlns:pic="http://schemas.openxmlformats.org/drawingml/2006/picture">
+                  <pic:nvPicPr>
+                    <pic:cNvPr id="1627815848" name="Picture 1627815848"/>
+                    <pic:cNvPicPr/>
+                  </pic:nvPicPr>
+                  <pic:blipFill>
+                    <a:blip r:embed="rId7" cstate="print">
+                      <a:extLst>
+                        <a:ext uri="{28A0092B-C50C-407E-A947-70E740481C1C}">
+                          <a14:useLocalDpi xmlns:a14="http://schemas.microsoft.com/office/drawing/2010/main" val="0"/>
+                        </a:ext>
+                      </a:extLst>
+                    </a:blip>
+                    <a:stretch>
+                      <a:fillRect/>
+                    </a:stretch>
+                  </pic:blipFill>
+                  <pic:spPr>
+                    <a:xfrm>
+                      <a:off x="0" y="0"/>
+                      <a:ext cx="5943600" cy="5158740"/>
+                    </a:xfrm>
+                    <a:prstGeom prst="rect">
+                      <a:avLst/>
+                    </a:prstGeom>
+                  </pic:spPr>
+                </pic:pic>
+              </a:graphicData>
+            </a:graphic>
+          </wp:inline>
+        </w:drawing>
+      </w:r>
+    </w:p>
+    <w:p>
+      <w:pPr>
+        <w:ind w:firstLine="720"/>
+      </w:pPr>
+    </w:p>
+    <w:p>
+      <w:pPr>
+        <w:ind w:firstLine="720"/>
+      </w:pPr>
+      <w:r>
+        <w:t xml:space="preserve">This diagram models our app’s Cloud </w:t>
+      </w:r>
+      <w:proofErr w:type="spellStart"/>
+      <w:r>
+        <w:t>Firestore</w:t>
+      </w:r>
+      <w:proofErr w:type="spellEnd"/>
+      <w:r>
+        <w:t xml:space="preserve"> NoSQL data structure using three main collections centered around campus posts: </w:t>
+      </w:r>
+      <w:r>
+        <w:br/>
+        <w:t xml:space="preserve">- </w:t>
+      </w:r>
+      <w:r>
+        <w:t xml:space="preserve">CAMPUS_POST (Main Collection): Stores the post details—title, content, category, author info, and timestamp, each identified by a unique </w:t>
+      </w:r>
+      <w:proofErr w:type="spellStart"/>
+      <w:r>
+        <w:t>Firestore</w:t>
+      </w:r>
+      <w:proofErr w:type="spellEnd"/>
+      <w:r>
+        <w:t xml:space="preserve"> document ID (PK). </w:t>
+      </w:r>
+      <w:r>
+        <w:br/>
+        <w:t xml:space="preserve">- </w:t>
+      </w:r>
+      <w:r>
+        <w:t xml:space="preserve">COMMENT (One-to-Many): One post can have multiple comments. Each comment references its parent post through the </w:t>
+      </w:r>
+      <w:proofErr w:type="spellStart"/>
+      <w:r>
+        <w:t>postId</w:t>
+      </w:r>
+      <w:proofErr w:type="spellEnd"/>
+      <w:r>
+        <w:t xml:space="preserve"> (FK). </w:t>
+      </w:r>
+      <w:r>
+        <w:br/>
+        <w:t xml:space="preserve">- </w:t>
+      </w:r>
+      <w:r>
+        <w:t xml:space="preserve">BOOKMARK (One-to-Many): One post can be saved by multiple users. It links a </w:t>
+      </w:r>
+      <w:proofErr w:type="spellStart"/>
+      <w:r>
+        <w:t>userId</w:t>
+      </w:r>
+      <w:proofErr w:type="spellEnd"/>
+      <w:r>
+        <w:t xml:space="preserve"> to the specific post via </w:t>
+      </w:r>
+      <w:proofErr w:type="spellStart"/>
+      <w:r>
+        <w:t>postId</w:t>
+      </w:r>
+      <w:proofErr w:type="spellEnd"/>
+      <w:r>
+        <w:t xml:space="preserve"> (FK) along with the timestamp it was saved. </w:t>
+      </w:r>
+    </w:p>
+    <w:p>
+      <w:pPr>
+        <w:ind w:firstLine="720"/>
+      </w:pPr>
     </w:p>
     <w:sectPr>
       <w:pgSz w:w="12240" w:h="15840"/>
@@ -1709,6 +1942,155 @@
     </w:lvl>
   </w:abstractNum>
   <w:abstractNum w:abstractNumId="4" w15:restartNumberingAfterBreak="0">
+    <w:nsid w:val="41691B68"/>
+    <w:multiLevelType w:val="multilevel"/>
+    <w:tmpl w:val="39EC700E"/>
+    <w:lvl w:ilvl="0">
+      <w:start w:val="1"/>
+      <w:numFmt w:val="bullet"/>
+      <w:lvlText w:val=""/>
+      <w:lvlJc w:val="left"/>
+      <w:pPr>
+        <w:tabs>
+          <w:tab w:val="num" w:pos="720"/>
+        </w:tabs>
+        <w:ind w:left="720" w:hanging="360"/>
+      </w:pPr>
+      <w:rPr>
+        <w:rFonts w:ascii="Symbol" w:hAnsi="Symbol" w:hint="default"/>
+        <w:sz w:val="20"/>
+      </w:rPr>
+    </w:lvl>
+    <w:lvl w:ilvl="1" w:tentative="1">
+      <w:start w:val="1"/>
+      <w:numFmt w:val="bullet"/>
+      <w:lvlText w:val="o"/>
+      <w:lvlJc w:val="left"/>
+      <w:pPr>
+        <w:tabs>
+          <w:tab w:val="num" w:pos="1440"/>
+        </w:tabs>
+        <w:ind w:left="1440" w:hanging="360"/>
+      </w:pPr>
+      <w:rPr>
+        <w:rFonts w:ascii="Courier New" w:hAnsi="Courier New" w:hint="default"/>
+        <w:sz w:val="20"/>
+      </w:rPr>
+    </w:lvl>
+    <w:lvl w:ilvl="2" w:tentative="1">
+      <w:start w:val="1"/>
+      <w:numFmt w:val="bullet"/>
+      <w:lvlText w:val=""/>
+      <w:lvlJc w:val="left"/>
+      <w:pPr>
+        <w:tabs>
+          <w:tab w:val="num" w:pos="2160"/>
+        </w:tabs>
+        <w:ind w:left="2160" w:hanging="360"/>
+      </w:pPr>
+      <w:rPr>
+        <w:rFonts w:ascii="Wingdings" w:hAnsi="Wingdings" w:hint="default"/>
+        <w:sz w:val="20"/>
+      </w:rPr>
+    </w:lvl>
+    <w:lvl w:ilvl="3" w:tentative="1">
+      <w:start w:val="1"/>
+      <w:numFmt w:val="bullet"/>
+      <w:lvlText w:val=""/>
+      <w:lvlJc w:val="left"/>
+      <w:pPr>
+        <w:tabs>
+          <w:tab w:val="num" w:pos="2880"/>
+        </w:tabs>
+        <w:ind w:left="2880" w:hanging="360"/>
+      </w:pPr>
+      <w:rPr>
+        <w:rFonts w:ascii="Wingdings" w:hAnsi="Wingdings" w:hint="default"/>
+        <w:sz w:val="20"/>
+      </w:rPr>
+    </w:lvl>
+    <w:lvl w:ilvl="4" w:tentative="1">
+      <w:start w:val="1"/>
+      <w:numFmt w:val="bullet"/>
+      <w:lvlText w:val=""/>
+      <w:lvlJc w:val="left"/>
+      <w:pPr>
+        <w:tabs>
+          <w:tab w:val="num" w:pos="3600"/>
+        </w:tabs>
+        <w:ind w:left="3600" w:hanging="360"/>
+      </w:pPr>
+      <w:rPr>
+        <w:rFonts w:ascii="Wingdings" w:hAnsi="Wingdings" w:hint="default"/>
+        <w:sz w:val="20"/>
+      </w:rPr>
+    </w:lvl>
+    <w:lvl w:ilvl="5" w:tentative="1">
+      <w:start w:val="1"/>
+      <w:numFmt w:val="bullet"/>
+      <w:lvlText w:val=""/>
+      <w:lvlJc w:val="left"/>
+      <w:pPr>
+        <w:tabs>
+          <w:tab w:val="num" w:pos="4320"/>
+        </w:tabs>
+        <w:ind w:left="4320" w:hanging="360"/>
+      </w:pPr>
+      <w:rPr>
+        <w:rFonts w:ascii="Wingdings" w:hAnsi="Wingdings" w:hint="default"/>
+        <w:sz w:val="20"/>
+      </w:rPr>
+    </w:lvl>
+    <w:lvl w:ilvl="6" w:tentative="1">
+      <w:start w:val="1"/>
+      <w:numFmt w:val="bullet"/>
+      <w:lvlText w:val=""/>
+      <w:lvlJc w:val="left"/>
+      <w:pPr>
+        <w:tabs>
+          <w:tab w:val="num" w:pos="5040"/>
+        </w:tabs>
+        <w:ind w:left="5040" w:hanging="360"/>
+      </w:pPr>
+      <w:rPr>
+        <w:rFonts w:ascii="Wingdings" w:hAnsi="Wingdings" w:hint="default"/>
+        <w:sz w:val="20"/>
+      </w:rPr>
+    </w:lvl>
+    <w:lvl w:ilvl="7" w:tentative="1">
+      <w:start w:val="1"/>
+      <w:numFmt w:val="bullet"/>
+      <w:lvlText w:val=""/>
+      <w:lvlJc w:val="left"/>
+      <w:pPr>
+        <w:tabs>
+          <w:tab w:val="num" w:pos="5760"/>
+        </w:tabs>
+        <w:ind w:left="5760" w:hanging="360"/>
+      </w:pPr>
+      <w:rPr>
+        <w:rFonts w:ascii="Wingdings" w:hAnsi="Wingdings" w:hint="default"/>
+        <w:sz w:val="20"/>
+      </w:rPr>
+    </w:lvl>
+    <w:lvl w:ilvl="8" w:tentative="1">
+      <w:start w:val="1"/>
+      <w:numFmt w:val="bullet"/>
+      <w:lvlText w:val=""/>
+      <w:lvlJc w:val="left"/>
+      <w:pPr>
+        <w:tabs>
+          <w:tab w:val="num" w:pos="6480"/>
+        </w:tabs>
+        <w:ind w:left="6480" w:hanging="360"/>
+      </w:pPr>
+      <w:rPr>
+        <w:rFonts w:ascii="Wingdings" w:hAnsi="Wingdings" w:hint="default"/>
+        <w:sz w:val="20"/>
+      </w:rPr>
+    </w:lvl>
+  </w:abstractNum>
+  <w:abstractNum w:abstractNumId="5" w15:restartNumberingAfterBreak="0">
     <w:nsid w:val="453C473D"/>
     <w:multiLevelType w:val="multilevel"/>
     <w:tmpl w:val="652A64D0"/>
@@ -1857,7 +2239,7 @@
       </w:rPr>
     </w:lvl>
   </w:abstractNum>
-  <w:abstractNum w:abstractNumId="5" w15:restartNumberingAfterBreak="0">
+  <w:abstractNum w:abstractNumId="6" w15:restartNumberingAfterBreak="0">
     <w:nsid w:val="600C676C"/>
     <w:multiLevelType w:val="multilevel"/>
     <w:tmpl w:val="B2667336"/>
@@ -1970,7 +2352,7 @@
       </w:pPr>
     </w:lvl>
   </w:abstractNum>
-  <w:abstractNum w:abstractNumId="6" w15:restartNumberingAfterBreak="0">
+  <w:abstractNum w:abstractNumId="7" w15:restartNumberingAfterBreak="0">
     <w:nsid w:val="76921A3F"/>
     <w:multiLevelType w:val="multilevel"/>
     <w:tmpl w:val="4F3E6C72"/>
@@ -2083,7 +2465,7 @@
       </w:pPr>
     </w:lvl>
   </w:abstractNum>
-  <w:abstractNum w:abstractNumId="7" w15:restartNumberingAfterBreak="0">
+  <w:abstractNum w:abstractNumId="8" w15:restartNumberingAfterBreak="0">
     <w:nsid w:val="7ABC442B"/>
     <w:multiLevelType w:val="multilevel"/>
     <w:tmpl w:val="DD5A7CE2"/>
@@ -2239,22 +2621,25 @@
     <w:abstractNumId w:val="0"/>
   </w:num>
   <w:num w:numId="3" w16cid:durableId="143081761">
-    <w:abstractNumId w:val="4"/>
+    <w:abstractNumId w:val="5"/>
   </w:num>
   <w:num w:numId="4" w16cid:durableId="991715594">
-    <w:abstractNumId w:val="5"/>
+    <w:abstractNumId w:val="6"/>
   </w:num>
   <w:num w:numId="5" w16cid:durableId="962225291">
     <w:abstractNumId w:val="1"/>
   </w:num>
   <w:num w:numId="6" w16cid:durableId="696271046">
-    <w:abstractNumId w:val="7"/>
+    <w:abstractNumId w:val="8"/>
   </w:num>
   <w:num w:numId="7" w16cid:durableId="1771662205">
     <w:abstractNumId w:val="2"/>
   </w:num>
   <w:num w:numId="8" w16cid:durableId="1451170301">
-    <w:abstractNumId w:val="6"/>
+    <w:abstractNumId w:val="7"/>
+  </w:num>
+  <w:num w:numId="9" w16cid:durableId="867378655">
+    <w:abstractNumId w:val="4"/>
   </w:num>
 </w:numbering>
 </file>

</xml_diff>

<commit_message>
updated the proposal and erd
</commit_message>
<xml_diff>
--- a/AZURES_PROPOSAL.docx
+++ b/AZURES_PROPOSAL.docx
@@ -11,14 +11,41 @@
         <w:t>201912723</w:t>
       </w:r>
     </w:p>
-    <w:p/>
     <w:p>
-      <w:r>
-        <w:t>PROJECT PROPOSAL</w:t>
-      </w:r>
+      <w:pPr>
+        <w:rPr>
+          <w:b/>
+          <w:bCs/>
+        </w:rPr>
+      </w:pPr>
     </w:p>
     <w:p>
-      <w:r>
+      <w:pPr>
+        <w:rPr>
+          <w:b/>
+          <w:bCs/>
+        </w:rPr>
+      </w:pPr>
+      <w:r>
+        <w:rPr>
+          <w:b/>
+          <w:bCs/>
+        </w:rPr>
+        <w:t>PROJECT PROPOSAL</w:t>
+      </w:r>
+    </w:p>
+    <w:p>
+      <w:pPr>
+        <w:rPr>
+          <w:b/>
+          <w:bCs/>
+        </w:rPr>
+      </w:pPr>
+      <w:r>
+        <w:rPr>
+          <w:b/>
+          <w:bCs/>
+        </w:rPr>
         <w:t>I. Project Details</w:t>
       </w:r>
     </w:p>
@@ -97,13 +124,31 @@
       </w:r>
     </w:p>
     <w:p>
-      <w:r>
+      <w:pPr>
+        <w:rPr>
+          <w:b/>
+          <w:bCs/>
+        </w:rPr>
+      </w:pPr>
+      <w:r>
+        <w:rPr>
+          <w:b/>
+          <w:bCs/>
+        </w:rPr>
         <w:t>II. Problem Statement</w:t>
       </w:r>
     </w:p>
     <w:p>
       <w:r>
-        <w:t xml:space="preserve">Mainstream social networking platforms like Facebook and public forums host an overwhelming amount of general clutter, algorithmic noise, commercial advertisements, and external traffic. As a consequence, Adamson University students struggle to locate urgent campus announcements, college-specific academic discussions, student organization notices, and lost-and-found reports. </w:t>
+        <w:t xml:space="preserve">Mainstream social networking platforms like Facebook and public forums host an overwhelming amount of general clutter, algorithmic noise, commercial advertisements, and external traffic. </w:t>
+      </w:r>
+      <w:proofErr w:type="gramStart"/>
+      <w:r>
+        <w:t>As a consequence</w:t>
+      </w:r>
+      <w:proofErr w:type="gramEnd"/>
+      <w:r>
+        <w:t xml:space="preserve">, Adamson University students struggle to locate urgent campus announcements, college-specific academic discussions, student organization notices, and lost-and-found reports. </w:t>
       </w:r>
     </w:p>
     <w:p>
@@ -120,7 +165,17 @@
       </w:r>
     </w:p>
     <w:p>
-      <w:r>
+      <w:pPr>
+        <w:rPr>
+          <w:b/>
+          <w:bCs/>
+        </w:rPr>
+      </w:pPr>
+      <w:r>
+        <w:rPr>
+          <w:b/>
+          <w:bCs/>
+        </w:rPr>
         <w:t>III. Proposed Solution</w:t>
       </w:r>
     </w:p>
@@ -131,108 +186,260 @@
       </w:r>
       <w:proofErr w:type="spellEnd"/>
       <w:r>
-        <w:t xml:space="preserve"> is an Android mobile bulletin and micro-community application built specifically for Adamson University students. Developed using modern declarative UI principles with Jetpack Compose, the application establishes a focused campus feed where students can compose academic or extracurricular posts, assign relevant category tags (such as Announcements, CS/IT, Lost &amp; Found, or Campus Life), and interact with active student entries. </w:t>
+        <w:t xml:space="preserve"> is an Android mobile bulletin and micro-community application built specifically for Adamson University students. Developed using modern declarative UI principles with Jetpack Compose, the application establishes a secure, authenticated campus feed where students register and log in using their official student number.</w:t>
       </w:r>
     </w:p>
     <w:p>
       <w:r>
-        <w:t xml:space="preserve">The application employs an architectural </w:t>
+        <w:t xml:space="preserve">The architecture integrates Cloud </w:t>
       </w:r>
       <w:proofErr w:type="spellStart"/>
       <w:r>
-        <w:t>ViewModel</w:t>
+        <w:t>Firestore</w:t>
       </w:r>
       <w:proofErr w:type="spellEnd"/>
       <w:r>
-        <w:t xml:space="preserve"> paired with Compose observable state to maintain post records during runtime, delivering full Create, Read, Update, and Delete (CRUD) capabilities across a seamless three-screen navigation structure. </w:t>
+        <w:t xml:space="preserve"> for remote data persistence and session tracking, backed by an MVVM pattern utilizing </w:t>
+      </w:r>
+      <w:proofErr w:type="spellStart"/>
+      <w:r>
+        <w:t>FeedViewModel</w:t>
+      </w:r>
+      <w:proofErr w:type="spellEnd"/>
+      <w:r>
+        <w:t xml:space="preserve"> and Kotlin Coroutines/Flows. Students can compose academic or extracurricular posts, assign relevant category tags (such as Announcements, CS/IT, Lost &amp; Found, Events, or General), leave real-time comments on peer entries, toggle post likes, and seamlessly navigate between global feeds and individual student profiles.</w:t>
       </w:r>
     </w:p>
     <w:p>
-      <w:r>
+      <w:pPr>
+        <w:rPr>
+          <w:b/>
+          <w:bCs/>
+        </w:rPr>
+      </w:pPr>
+      <w:r>
+        <w:rPr>
+          <w:b/>
+          <w:bCs/>
+        </w:rPr>
+        <w:lastRenderedPageBreak/>
         <w:t>IV. Main Features</w:t>
       </w:r>
     </w:p>
     <w:p>
       <w:pPr>
+        <w:pStyle w:val="ListParagraph"/>
         <w:numPr>
           <w:ilvl w:val="0"/>
-          <w:numId w:val="6"/>
+          <w:numId w:val="11"/>
         </w:numPr>
       </w:pPr>
       <w:r>
-        <w:lastRenderedPageBreak/>
-        <w:t xml:space="preserve">Campus Feed Stream (Read): Displays an organized, chronological collection of student posts in a clean card layout powered by </w:t>
-      </w:r>
-      <w:proofErr w:type="spellStart"/>
-      <w:r>
-        <w:t>LazyColumn</w:t>
-      </w:r>
-      <w:proofErr w:type="spellEnd"/>
-      <w:r>
-        <w:t xml:space="preserve">, featuring author labels, timestamps, and department/category tags. </w:t>
+        <w:rPr>
+          <w:b/>
+          <w:bCs/>
+        </w:rPr>
+        <w:t>Authentication &amp; Student Identity Management:</w:t>
+      </w:r>
+      <w:r>
+        <w:t xml:space="preserve"> A secure registration and login workflow enforcing unique, valid Adamson Student Numbers as primary document keys to eliminate duplicate accounts and verify author authenticity.</w:t>
       </w:r>
     </w:p>
     <w:p>
       <w:pPr>
+        <w:pStyle w:val="ListParagraph"/>
         <w:numPr>
           <w:ilvl w:val="0"/>
-          <w:numId w:val="6"/>
+          <w:numId w:val="11"/>
         </w:numPr>
       </w:pPr>
       <w:r>
-        <w:t xml:space="preserve">Post Authoring Studio (Create): Enables students to compose new updates by inputting a post title, category tag, and detailed body text before committing the record to the campus board. </w:t>
+        <w:rPr>
+          <w:b/>
+          <w:bCs/>
+        </w:rPr>
+        <w:t>Campus Feed Stream (Read):</w:t>
+      </w:r>
+      <w:r>
+        <w:t xml:space="preserve"> Displays an organized, chronological collection of campus posts using an Instagram-style visual layout inside a </w:t>
+      </w:r>
+      <w:proofErr w:type="spellStart"/>
+      <w:r>
+        <w:t>LazyColumn</w:t>
+      </w:r>
+      <w:proofErr w:type="spellEnd"/>
+      <w:r>
+        <w:t>. Each card features the author's avatar initial, clickable handle, category badge, post summary card, dynamic like count, and comment indicators.</w:t>
       </w:r>
     </w:p>
     <w:p>
       <w:pPr>
+        <w:pStyle w:val="ListParagraph"/>
         <w:numPr>
           <w:ilvl w:val="0"/>
-          <w:numId w:val="6"/>
+          <w:numId w:val="11"/>
         </w:numPr>
       </w:pPr>
       <w:r>
-        <w:t xml:space="preserve">Detailed Bulletin Inspector (Read): A dedicated inspection screen presenting the complete post content, category metadata, and author details. </w:t>
+        <w:rPr>
+          <w:b/>
+          <w:bCs/>
+        </w:rPr>
+        <w:t>Student Profile Routing &amp; Inspection:</w:t>
+      </w:r>
+      <w:r>
+        <w:t xml:space="preserve"> A modular profile screen supporting both "My Profile" (with account logout functionality) and read-only student views when tapping an author's handle or avatar from the feed or detail screens.</w:t>
       </w:r>
     </w:p>
     <w:p>
       <w:pPr>
+        <w:pStyle w:val="ListParagraph"/>
         <w:numPr>
           <w:ilvl w:val="0"/>
-          <w:numId w:val="6"/>
+          <w:numId w:val="11"/>
         </w:numPr>
       </w:pPr>
       <w:r>
-        <w:t xml:space="preserve">Post Content Modifier (Update): Allows the author to modify an existing post's title, category classification, or content body through an edit form with synchronized state updates. </w:t>
+        <w:rPr>
+          <w:b/>
+          <w:bCs/>
+        </w:rPr>
+        <w:t>Post Authoring &amp; Editing Studio (Create/Update):</w:t>
+      </w:r>
+      <w:r>
+        <w:t xml:space="preserve"> Enables students to create new updates or modify their own existing entries with custom category selectors, titles, and body content, automatically binding authorship metadata to the active session.</w:t>
       </w:r>
     </w:p>
     <w:p>
       <w:pPr>
+        <w:pStyle w:val="ListParagraph"/>
         <w:numPr>
           <w:ilvl w:val="0"/>
-          <w:numId w:val="6"/>
+          <w:numId w:val="11"/>
         </w:numPr>
       </w:pPr>
       <w:r>
-        <w:t xml:space="preserve">Direct Entry Deletion (Delete): Provides an immediate removal option from the detail view to purge outdated bulletins, resolved lost-and-found items, or erroneous posts. </w:t>
+        <w:rPr>
+          <w:b/>
+          <w:bCs/>
+        </w:rPr>
+        <w:t>Detailed Bulletin Inspector with Real-Time Comments:</w:t>
+      </w:r>
+      <w:r>
+        <w:t xml:space="preserve"> A dedicated inspection screen presenting complete post body text, author student verification, and a live, nested comment thread synchronized via </w:t>
+      </w:r>
+      <w:proofErr w:type="spellStart"/>
+      <w:r>
+        <w:t>Firestore</w:t>
+      </w:r>
+      <w:proofErr w:type="spellEnd"/>
+      <w:r>
+        <w:t xml:space="preserve"> sub-collections.</w:t>
       </w:r>
     </w:p>
     <w:p>
-      <w:r>
-        <w:t>V. Data or Information to be Managed</w:t>
+      <w:pPr>
+        <w:pStyle w:val="ListParagraph"/>
+        <w:numPr>
+          <w:ilvl w:val="0"/>
+          <w:numId w:val="11"/>
+        </w:numPr>
+      </w:pPr>
+      <w:r>
+        <w:rPr>
+          <w:b/>
+          <w:bCs/>
+        </w:rPr>
+        <w:t>Dynamic Interaction Layer (Likes &amp; Comment Counters):</w:t>
+      </w:r>
+      <w:r>
+        <w:t xml:space="preserve"> Direct engagement controls allowing students to like posts and write comments, with aggregate counters synchronized between individual posts and the main campus feed.</w:t>
       </w:r>
     </w:p>
     <w:p>
-      <w:r>
-        <w:t xml:space="preserve">The core data structure managed by the application is the </w:t>
+      <w:pPr>
+        <w:pStyle w:val="ListParagraph"/>
+        <w:numPr>
+          <w:ilvl w:val="0"/>
+          <w:numId w:val="11"/>
+        </w:numPr>
+      </w:pPr>
+      <w:r>
+        <w:rPr>
+          <w:b/>
+          <w:bCs/>
+        </w:rPr>
+        <w:t>Direct Entry Deletion (Delete):</w:t>
+      </w:r>
+      <w:r>
+        <w:t xml:space="preserve"> Provides an immediate removal option restricted to the original author within the detail view to purge outdated bulletins, resolved lost-and-found claims, or completed notices.</w:t>
+      </w:r>
+    </w:p>
+    <w:p>
+      <w:pPr>
+        <w:rPr>
+          <w:b/>
+          <w:bCs/>
+        </w:rPr>
+      </w:pPr>
+      <w:r>
+        <w:rPr>
+          <w:b/>
+          <w:bCs/>
+        </w:rPr>
+        <w:t>V. Data or Information to be Managed</w:t>
+      </w:r>
+    </w:p>
+    <w:p>
+      <w:r>
+        <w:t xml:space="preserve">The system manages three primary data models backed by Cloud </w:t>
       </w:r>
       <w:proofErr w:type="spellStart"/>
       <w:r>
-        <w:t>CampusPost</w:t>
+        <w:t>Firestore</w:t>
       </w:r>
       <w:proofErr w:type="spellEnd"/>
       <w:r>
-        <w:t xml:space="preserve"> model: </w:t>
-      </w:r>
+        <w:t xml:space="preserve"> collections:</w:t>
+      </w:r>
+    </w:p>
+    <w:p>
+      <w:pPr>
+        <w:rPr>
+          <w:b/>
+          <w:bCs/>
+        </w:rPr>
+      </w:pPr>
+      <w:r>
+        <w:rPr>
+          <w:b/>
+          <w:bCs/>
+        </w:rPr>
+        <w:t>1. User Entity (users Collection)</w:t>
+      </w:r>
+    </w:p>
+    <w:p>
+      <w:pPr>
+        <w:numPr>
+          <w:ilvl w:val="0"/>
+          <w:numId w:val="12"/>
+        </w:numPr>
+      </w:pPr>
+      <w:r>
+        <w:rPr>
+          <w:b/>
+          <w:bCs/>
+        </w:rPr>
+        <w:t>Document ID:</w:t>
+      </w:r>
+      <w:r>
+        <w:t xml:space="preserve"> </w:t>
+      </w:r>
+      <w:proofErr w:type="spellStart"/>
+      <w:r>
+        <w:t>studentNumber</w:t>
+      </w:r>
+      <w:proofErr w:type="spellEnd"/>
     </w:p>
     <w:tbl>
       <w:tblPr>
@@ -248,8 +455,8 @@
       </w:tblPr>
       <w:tblGrid>
         <w:gridCol w:w="1946"/>
-        <w:gridCol w:w="1228"/>
-        <w:gridCol w:w="6170"/>
+        <w:gridCol w:w="1403"/>
+        <w:gridCol w:w="5681"/>
       </w:tblGrid>
       <w:tr>
         <w:trPr>
@@ -276,6 +483,10 @@
           </w:tcPr>
           <w:p>
             <w:r>
+              <w:rPr>
+                <w:b/>
+                <w:bCs/>
+              </w:rPr>
               <w:t>Attribute</w:t>
             </w:r>
           </w:p>
@@ -300,6 +511,10 @@
           </w:tcPr>
           <w:p>
             <w:r>
+              <w:rPr>
+                <w:b/>
+                <w:bCs/>
+              </w:rPr>
               <w:t>Data Type</w:t>
             </w:r>
           </w:p>
@@ -324,161 +539,11 @@
           </w:tcPr>
           <w:p>
             <w:r>
+              <w:rPr>
+                <w:b/>
+                <w:bCs/>
+              </w:rPr>
               <w:t>Description</w:t>
-            </w:r>
-          </w:p>
-        </w:tc>
-      </w:tr>
-      <w:tr>
-        <w:trPr>
-          <w:tblCellSpacing w:w="15" w:type="dxa"/>
-        </w:trPr>
-        <w:tc>
-          <w:tcPr>
-            <w:tcW w:w="0" w:type="auto"/>
-            <w:tcBorders>
-              <w:top w:val="single" w:sz="6" w:space="0" w:color="C4C7C5"/>
-              <w:left w:val="single" w:sz="6" w:space="0" w:color="C4C7C5"/>
-              <w:bottom w:val="single" w:sz="6" w:space="0" w:color="C4C7C5"/>
-              <w:right w:val="single" w:sz="6" w:space="0" w:color="C4C7C5"/>
-            </w:tcBorders>
-            <w:tcMar>
-              <w:top w:w="120" w:type="dxa"/>
-              <w:left w:w="180" w:type="dxa"/>
-              <w:bottom w:w="120" w:type="dxa"/>
-              <w:right w:w="180" w:type="dxa"/>
-            </w:tcMar>
-            <w:vAlign w:val="center"/>
-            <w:hideMark/>
-          </w:tcPr>
-          <w:p>
-            <w:r>
-              <w:t>id</w:t>
-            </w:r>
-          </w:p>
-        </w:tc>
-        <w:tc>
-          <w:tcPr>
-            <w:tcW w:w="0" w:type="auto"/>
-            <w:tcBorders>
-              <w:top w:val="single" w:sz="6" w:space="0" w:color="C4C7C5"/>
-              <w:left w:val="single" w:sz="6" w:space="0" w:color="C4C7C5"/>
-              <w:bottom w:val="single" w:sz="6" w:space="0" w:color="C4C7C5"/>
-              <w:right w:val="single" w:sz="6" w:space="0" w:color="C4C7C5"/>
-            </w:tcBorders>
-            <w:tcMar>
-              <w:top w:w="120" w:type="dxa"/>
-              <w:left w:w="180" w:type="dxa"/>
-              <w:bottom w:w="120" w:type="dxa"/>
-              <w:right w:w="180" w:type="dxa"/>
-            </w:tcMar>
-            <w:vAlign w:val="center"/>
-            <w:hideMark/>
-          </w:tcPr>
-          <w:p>
-            <w:r>
-              <w:t>String</w:t>
-            </w:r>
-          </w:p>
-        </w:tc>
-        <w:tc>
-          <w:tcPr>
-            <w:tcW w:w="0" w:type="auto"/>
-            <w:tcBorders>
-              <w:top w:val="single" w:sz="6" w:space="0" w:color="C4C7C5"/>
-              <w:left w:val="single" w:sz="6" w:space="0" w:color="C4C7C5"/>
-              <w:bottom w:val="single" w:sz="6" w:space="0" w:color="C4C7C5"/>
-              <w:right w:val="single" w:sz="6" w:space="0" w:color="C4C7C5"/>
-            </w:tcBorders>
-            <w:tcMar>
-              <w:top w:w="120" w:type="dxa"/>
-              <w:left w:w="180" w:type="dxa"/>
-              <w:bottom w:w="120" w:type="dxa"/>
-              <w:right w:w="180" w:type="dxa"/>
-            </w:tcMar>
-            <w:vAlign w:val="center"/>
-            <w:hideMark/>
-          </w:tcPr>
-          <w:p>
-            <w:r>
-              <w:t xml:space="preserve">Unique identifier generated per post record via UUID. </w:t>
-            </w:r>
-          </w:p>
-        </w:tc>
-      </w:tr>
-      <w:tr>
-        <w:trPr>
-          <w:tblCellSpacing w:w="15" w:type="dxa"/>
-        </w:trPr>
-        <w:tc>
-          <w:tcPr>
-            <w:tcW w:w="0" w:type="auto"/>
-            <w:tcBorders>
-              <w:top w:val="single" w:sz="6" w:space="0" w:color="C4C7C5"/>
-              <w:left w:val="single" w:sz="6" w:space="0" w:color="C4C7C5"/>
-              <w:bottom w:val="single" w:sz="6" w:space="0" w:color="C4C7C5"/>
-              <w:right w:val="single" w:sz="6" w:space="0" w:color="C4C7C5"/>
-            </w:tcBorders>
-            <w:tcMar>
-              <w:top w:w="120" w:type="dxa"/>
-              <w:left w:w="180" w:type="dxa"/>
-              <w:bottom w:w="120" w:type="dxa"/>
-              <w:right w:w="180" w:type="dxa"/>
-            </w:tcMar>
-            <w:vAlign w:val="center"/>
-            <w:hideMark/>
-          </w:tcPr>
-          <w:p>
-            <w:r>
-              <w:t>author</w:t>
-            </w:r>
-          </w:p>
-        </w:tc>
-        <w:tc>
-          <w:tcPr>
-            <w:tcW w:w="0" w:type="auto"/>
-            <w:tcBorders>
-              <w:top w:val="single" w:sz="6" w:space="0" w:color="C4C7C5"/>
-              <w:left w:val="single" w:sz="6" w:space="0" w:color="C4C7C5"/>
-              <w:bottom w:val="single" w:sz="6" w:space="0" w:color="C4C7C5"/>
-              <w:right w:val="single" w:sz="6" w:space="0" w:color="C4C7C5"/>
-            </w:tcBorders>
-            <w:tcMar>
-              <w:top w:w="120" w:type="dxa"/>
-              <w:left w:w="180" w:type="dxa"/>
-              <w:bottom w:w="120" w:type="dxa"/>
-              <w:right w:w="180" w:type="dxa"/>
-            </w:tcMar>
-            <w:vAlign w:val="center"/>
-            <w:hideMark/>
-          </w:tcPr>
-          <w:p>
-            <w:r>
-              <w:t>String</w:t>
-            </w:r>
-          </w:p>
-        </w:tc>
-        <w:tc>
-          <w:tcPr>
-            <w:tcW w:w="0" w:type="auto"/>
-            <w:tcBorders>
-              <w:top w:val="single" w:sz="6" w:space="0" w:color="C4C7C5"/>
-              <w:left w:val="single" w:sz="6" w:space="0" w:color="C4C7C5"/>
-              <w:bottom w:val="single" w:sz="6" w:space="0" w:color="C4C7C5"/>
-              <w:right w:val="single" w:sz="6" w:space="0" w:color="C4C7C5"/>
-            </w:tcBorders>
-            <w:tcMar>
-              <w:top w:w="120" w:type="dxa"/>
-              <w:left w:w="180" w:type="dxa"/>
-              <w:bottom w:w="120" w:type="dxa"/>
-              <w:right w:w="180" w:type="dxa"/>
-            </w:tcMar>
-            <w:vAlign w:val="center"/>
-            <w:hideMark/>
-          </w:tcPr>
-          <w:p>
-            <w:r>
-              <w:t xml:space="preserve">Full name or display name of the student author. </w:t>
             </w:r>
           </w:p>
         </w:tc>
@@ -533,7 +598,7 @@
           </w:tcPr>
           <w:p>
             <w:r>
-              <w:t>String</w:t>
+              <w:t>String (PK)</w:t>
             </w:r>
           </w:p>
         </w:tc>
@@ -557,7 +622,7 @@
           </w:tcPr>
           <w:p>
             <w:r>
-              <w:t>Student ID tag or department identifier for university context.</w:t>
+              <w:t>Unique university-issued student identification number.</w:t>
             </w:r>
           </w:p>
         </w:tc>
@@ -585,9 +650,11 @@
             <w:hideMark/>
           </w:tcPr>
           <w:p>
-            <w:r>
-              <w:t>title</w:t>
-            </w:r>
+            <w:proofErr w:type="spellStart"/>
+            <w:r>
+              <w:t>fullName</w:t>
+            </w:r>
+            <w:proofErr w:type="spellEnd"/>
           </w:p>
         </w:tc>
         <w:tc>
@@ -634,7 +701,7 @@
           </w:tcPr>
           <w:p>
             <w:r>
-              <w:t xml:space="preserve">Headline or subject summary of the post. </w:t>
+              <w:t>Complete legal or registered student name.</w:t>
             </w:r>
           </w:p>
         </w:tc>
@@ -663,7 +730,7 @@
           </w:tcPr>
           <w:p>
             <w:r>
-              <w:t>category</w:t>
+              <w:t>username</w:t>
             </w:r>
           </w:p>
         </w:tc>
@@ -711,7 +778,7 @@
           </w:tcPr>
           <w:p>
             <w:r>
-              <w:t xml:space="preserve">Departmental or thematic tag (e.g., Announcements, CS/IT, Events, Lost &amp; Found). </w:t>
+              <w:t>Unique profile handle (rendered as @username).</w:t>
             </w:r>
           </w:p>
         </w:tc>
@@ -740,7 +807,7 @@
           </w:tcPr>
           <w:p>
             <w:r>
-              <w:t>content</w:t>
+              <w:t>password</w:t>
             </w:r>
           </w:p>
         </w:tc>
@@ -788,7 +855,7 @@
           </w:tcPr>
           <w:p>
             <w:r>
-              <w:t xml:space="preserve">Complete body text of the bulletin or student message. </w:t>
+              <w:t>Account authentication password.</w:t>
             </w:r>
           </w:p>
         </w:tc>
@@ -817,7 +884,8 @@
           </w:tcPr>
           <w:p>
             <w:r>
-              <w:t>timestamp</w:t>
+              <w:lastRenderedPageBreak/>
+              <w:t>bio</w:t>
             </w:r>
           </w:p>
         </w:tc>
@@ -865,154 +933,2107 @@
           </w:tcPr>
           <w:p>
             <w:r>
-              <w:t>Formatted relative time or creation timestamp.</w:t>
+              <w:t>Short student bio, department info, or profile status.</w:t>
             </w:r>
           </w:p>
         </w:tc>
       </w:tr>
     </w:tbl>
     <w:p>
-      <w:r>
-        <w:t>CRUD Operations Breakdown</w:t>
+      <w:pPr>
+        <w:rPr>
+          <w:b/>
+          <w:bCs/>
+        </w:rPr>
+      </w:pPr>
+      <w:r>
+        <w:rPr>
+          <w:b/>
+          <w:bCs/>
+        </w:rPr>
+        <w:t xml:space="preserve">2. </w:t>
+      </w:r>
+      <w:proofErr w:type="spellStart"/>
+      <w:r>
+        <w:rPr>
+          <w:b/>
+          <w:bCs/>
+        </w:rPr>
+        <w:t>CampusPost</w:t>
+      </w:r>
+      <w:proofErr w:type="spellEnd"/>
+      <w:r>
+        <w:rPr>
+          <w:b/>
+          <w:bCs/>
+        </w:rPr>
+        <w:t xml:space="preserve"> Entity (posts Collection)</w:t>
       </w:r>
     </w:p>
     <w:p>
       <w:pPr>
         <w:numPr>
           <w:ilvl w:val="0"/>
-          <w:numId w:val="7"/>
+          <w:numId w:val="13"/>
         </w:numPr>
       </w:pPr>
       <w:r>
-        <w:t xml:space="preserve">Create: Instantiates a new </w:t>
+        <w:rPr>
+          <w:b/>
+          <w:bCs/>
+        </w:rPr>
+        <w:t>Document ID:</w:t>
+      </w:r>
+      <w:r>
+        <w:t xml:space="preserve"> Auto-generated UUID / </w:t>
       </w:r>
       <w:proofErr w:type="spellStart"/>
       <w:r>
-        <w:t>CampusPost</w:t>
+        <w:t>Firestore</w:t>
       </w:r>
       <w:proofErr w:type="spellEnd"/>
       <w:r>
-        <w:t xml:space="preserve"> from the composition screen and prepends it to the </w:t>
+        <w:t xml:space="preserve"> Document ID</w:t>
+      </w:r>
+    </w:p>
+    <w:tbl>
+      <w:tblPr>
+        <w:tblW w:w="0" w:type="auto"/>
+        <w:tblCellSpacing w:w="15" w:type="dxa"/>
+        <w:tblCellMar>
+          <w:top w:w="15" w:type="dxa"/>
+          <w:left w:w="15" w:type="dxa"/>
+          <w:bottom w:w="15" w:type="dxa"/>
+          <w:right w:w="15" w:type="dxa"/>
+        </w:tblCellMar>
+        <w:tblLook w:val="04A0" w:firstRow="1" w:lastRow="0" w:firstColumn="1" w:lastColumn="0" w:noHBand="0" w:noVBand="1"/>
+      </w:tblPr>
+      <w:tblGrid>
+        <w:gridCol w:w="2591"/>
+        <w:gridCol w:w="1231"/>
+        <w:gridCol w:w="5522"/>
+      </w:tblGrid>
+      <w:tr>
+        <w:trPr>
+          <w:tblHeader/>
+          <w:tblCellSpacing w:w="15" w:type="dxa"/>
+        </w:trPr>
+        <w:tc>
+          <w:tcPr>
+            <w:tcW w:w="0" w:type="auto"/>
+            <w:tcBorders>
+              <w:top w:val="single" w:sz="6" w:space="0" w:color="C4C7C5"/>
+              <w:left w:val="single" w:sz="6" w:space="0" w:color="C4C7C5"/>
+              <w:bottom w:val="single" w:sz="6" w:space="0" w:color="C4C7C5"/>
+              <w:right w:val="single" w:sz="6" w:space="0" w:color="C4C7C5"/>
+            </w:tcBorders>
+            <w:tcMar>
+              <w:top w:w="120" w:type="dxa"/>
+              <w:left w:w="180" w:type="dxa"/>
+              <w:bottom w:w="120" w:type="dxa"/>
+              <w:right w:w="180" w:type="dxa"/>
+            </w:tcMar>
+            <w:vAlign w:val="center"/>
+            <w:hideMark/>
+          </w:tcPr>
+          <w:p>
+            <w:r>
+              <w:rPr>
+                <w:b/>
+                <w:bCs/>
+              </w:rPr>
+              <w:t>Attribute</w:t>
+            </w:r>
+          </w:p>
+        </w:tc>
+        <w:tc>
+          <w:tcPr>
+            <w:tcW w:w="0" w:type="auto"/>
+            <w:tcBorders>
+              <w:top w:val="single" w:sz="6" w:space="0" w:color="C4C7C5"/>
+              <w:left w:val="single" w:sz="6" w:space="0" w:color="C4C7C5"/>
+              <w:bottom w:val="single" w:sz="6" w:space="0" w:color="C4C7C5"/>
+              <w:right w:val="single" w:sz="6" w:space="0" w:color="C4C7C5"/>
+            </w:tcBorders>
+            <w:tcMar>
+              <w:top w:w="120" w:type="dxa"/>
+              <w:left w:w="180" w:type="dxa"/>
+              <w:bottom w:w="120" w:type="dxa"/>
+              <w:right w:w="180" w:type="dxa"/>
+            </w:tcMar>
+            <w:vAlign w:val="center"/>
+            <w:hideMark/>
+          </w:tcPr>
+          <w:p>
+            <w:r>
+              <w:rPr>
+                <w:b/>
+                <w:bCs/>
+              </w:rPr>
+              <w:t>Data Type</w:t>
+            </w:r>
+          </w:p>
+        </w:tc>
+        <w:tc>
+          <w:tcPr>
+            <w:tcW w:w="0" w:type="auto"/>
+            <w:tcBorders>
+              <w:top w:val="single" w:sz="6" w:space="0" w:color="C4C7C5"/>
+              <w:left w:val="single" w:sz="6" w:space="0" w:color="C4C7C5"/>
+              <w:bottom w:val="single" w:sz="6" w:space="0" w:color="C4C7C5"/>
+              <w:right w:val="single" w:sz="6" w:space="0" w:color="C4C7C5"/>
+            </w:tcBorders>
+            <w:tcMar>
+              <w:top w:w="120" w:type="dxa"/>
+              <w:left w:w="180" w:type="dxa"/>
+              <w:bottom w:w="120" w:type="dxa"/>
+              <w:right w:w="180" w:type="dxa"/>
+            </w:tcMar>
+            <w:vAlign w:val="center"/>
+            <w:hideMark/>
+          </w:tcPr>
+          <w:p>
+            <w:r>
+              <w:rPr>
+                <w:b/>
+                <w:bCs/>
+              </w:rPr>
+              <w:t>Description</w:t>
+            </w:r>
+          </w:p>
+        </w:tc>
+      </w:tr>
+      <w:tr>
+        <w:trPr>
+          <w:tblCellSpacing w:w="15" w:type="dxa"/>
+        </w:trPr>
+        <w:tc>
+          <w:tcPr>
+            <w:tcW w:w="0" w:type="auto"/>
+            <w:tcBorders>
+              <w:top w:val="single" w:sz="6" w:space="0" w:color="C4C7C5"/>
+              <w:left w:val="single" w:sz="6" w:space="0" w:color="C4C7C5"/>
+              <w:bottom w:val="single" w:sz="6" w:space="0" w:color="C4C7C5"/>
+              <w:right w:val="single" w:sz="6" w:space="0" w:color="C4C7C5"/>
+            </w:tcBorders>
+            <w:tcMar>
+              <w:top w:w="120" w:type="dxa"/>
+              <w:left w:w="180" w:type="dxa"/>
+              <w:bottom w:w="120" w:type="dxa"/>
+              <w:right w:w="180" w:type="dxa"/>
+            </w:tcMar>
+            <w:vAlign w:val="center"/>
+            <w:hideMark/>
+          </w:tcPr>
+          <w:p>
+            <w:r>
+              <w:t>id</w:t>
+            </w:r>
+          </w:p>
+        </w:tc>
+        <w:tc>
+          <w:tcPr>
+            <w:tcW w:w="0" w:type="auto"/>
+            <w:tcBorders>
+              <w:top w:val="single" w:sz="6" w:space="0" w:color="C4C7C5"/>
+              <w:left w:val="single" w:sz="6" w:space="0" w:color="C4C7C5"/>
+              <w:bottom w:val="single" w:sz="6" w:space="0" w:color="C4C7C5"/>
+              <w:right w:val="single" w:sz="6" w:space="0" w:color="C4C7C5"/>
+            </w:tcBorders>
+            <w:tcMar>
+              <w:top w:w="120" w:type="dxa"/>
+              <w:left w:w="180" w:type="dxa"/>
+              <w:bottom w:w="120" w:type="dxa"/>
+              <w:right w:w="180" w:type="dxa"/>
+            </w:tcMar>
+            <w:vAlign w:val="center"/>
+            <w:hideMark/>
+          </w:tcPr>
+          <w:p>
+            <w:r>
+              <w:t>String (PK)</w:t>
+            </w:r>
+          </w:p>
+        </w:tc>
+        <w:tc>
+          <w:tcPr>
+            <w:tcW w:w="0" w:type="auto"/>
+            <w:tcBorders>
+              <w:top w:val="single" w:sz="6" w:space="0" w:color="C4C7C5"/>
+              <w:left w:val="single" w:sz="6" w:space="0" w:color="C4C7C5"/>
+              <w:bottom w:val="single" w:sz="6" w:space="0" w:color="C4C7C5"/>
+              <w:right w:val="single" w:sz="6" w:space="0" w:color="C4C7C5"/>
+            </w:tcBorders>
+            <w:tcMar>
+              <w:top w:w="120" w:type="dxa"/>
+              <w:left w:w="180" w:type="dxa"/>
+              <w:bottom w:w="120" w:type="dxa"/>
+              <w:right w:w="180" w:type="dxa"/>
+            </w:tcMar>
+            <w:vAlign w:val="center"/>
+            <w:hideMark/>
+          </w:tcPr>
+          <w:p>
+            <w:r>
+              <w:t>Unique identifier for each post entry.</w:t>
+            </w:r>
+          </w:p>
+        </w:tc>
+      </w:tr>
+      <w:tr>
+        <w:trPr>
+          <w:tblCellSpacing w:w="15" w:type="dxa"/>
+        </w:trPr>
+        <w:tc>
+          <w:tcPr>
+            <w:tcW w:w="0" w:type="auto"/>
+            <w:tcBorders>
+              <w:top w:val="single" w:sz="6" w:space="0" w:color="C4C7C5"/>
+              <w:left w:val="single" w:sz="6" w:space="0" w:color="C4C7C5"/>
+              <w:bottom w:val="single" w:sz="6" w:space="0" w:color="C4C7C5"/>
+              <w:right w:val="single" w:sz="6" w:space="0" w:color="C4C7C5"/>
+            </w:tcBorders>
+            <w:tcMar>
+              <w:top w:w="120" w:type="dxa"/>
+              <w:left w:w="180" w:type="dxa"/>
+              <w:bottom w:w="120" w:type="dxa"/>
+              <w:right w:w="180" w:type="dxa"/>
+            </w:tcMar>
+            <w:vAlign w:val="center"/>
+            <w:hideMark/>
+          </w:tcPr>
+          <w:p>
+            <w:r>
+              <w:t>title</w:t>
+            </w:r>
+          </w:p>
+        </w:tc>
+        <w:tc>
+          <w:tcPr>
+            <w:tcW w:w="0" w:type="auto"/>
+            <w:tcBorders>
+              <w:top w:val="single" w:sz="6" w:space="0" w:color="C4C7C5"/>
+              <w:left w:val="single" w:sz="6" w:space="0" w:color="C4C7C5"/>
+              <w:bottom w:val="single" w:sz="6" w:space="0" w:color="C4C7C5"/>
+              <w:right w:val="single" w:sz="6" w:space="0" w:color="C4C7C5"/>
+            </w:tcBorders>
+            <w:tcMar>
+              <w:top w:w="120" w:type="dxa"/>
+              <w:left w:w="180" w:type="dxa"/>
+              <w:bottom w:w="120" w:type="dxa"/>
+              <w:right w:w="180" w:type="dxa"/>
+            </w:tcMar>
+            <w:vAlign w:val="center"/>
+            <w:hideMark/>
+          </w:tcPr>
+          <w:p>
+            <w:r>
+              <w:t>String</w:t>
+            </w:r>
+          </w:p>
+        </w:tc>
+        <w:tc>
+          <w:tcPr>
+            <w:tcW w:w="0" w:type="auto"/>
+            <w:tcBorders>
+              <w:top w:val="single" w:sz="6" w:space="0" w:color="C4C7C5"/>
+              <w:left w:val="single" w:sz="6" w:space="0" w:color="C4C7C5"/>
+              <w:bottom w:val="single" w:sz="6" w:space="0" w:color="C4C7C5"/>
+              <w:right w:val="single" w:sz="6" w:space="0" w:color="C4C7C5"/>
+            </w:tcBorders>
+            <w:tcMar>
+              <w:top w:w="120" w:type="dxa"/>
+              <w:left w:w="180" w:type="dxa"/>
+              <w:bottom w:w="120" w:type="dxa"/>
+              <w:right w:w="180" w:type="dxa"/>
+            </w:tcMar>
+            <w:vAlign w:val="center"/>
+            <w:hideMark/>
+          </w:tcPr>
+          <w:p>
+            <w:r>
+              <w:t>Subject headline or title summary.</w:t>
+            </w:r>
+          </w:p>
+        </w:tc>
+      </w:tr>
+      <w:tr>
+        <w:trPr>
+          <w:tblCellSpacing w:w="15" w:type="dxa"/>
+        </w:trPr>
+        <w:tc>
+          <w:tcPr>
+            <w:tcW w:w="0" w:type="auto"/>
+            <w:tcBorders>
+              <w:top w:val="single" w:sz="6" w:space="0" w:color="C4C7C5"/>
+              <w:left w:val="single" w:sz="6" w:space="0" w:color="C4C7C5"/>
+              <w:bottom w:val="single" w:sz="6" w:space="0" w:color="C4C7C5"/>
+              <w:right w:val="single" w:sz="6" w:space="0" w:color="C4C7C5"/>
+            </w:tcBorders>
+            <w:tcMar>
+              <w:top w:w="120" w:type="dxa"/>
+              <w:left w:w="180" w:type="dxa"/>
+              <w:bottom w:w="120" w:type="dxa"/>
+              <w:right w:w="180" w:type="dxa"/>
+            </w:tcMar>
+            <w:vAlign w:val="center"/>
+            <w:hideMark/>
+          </w:tcPr>
+          <w:p>
+            <w:r>
+              <w:t>category</w:t>
+            </w:r>
+          </w:p>
+        </w:tc>
+        <w:tc>
+          <w:tcPr>
+            <w:tcW w:w="0" w:type="auto"/>
+            <w:tcBorders>
+              <w:top w:val="single" w:sz="6" w:space="0" w:color="C4C7C5"/>
+              <w:left w:val="single" w:sz="6" w:space="0" w:color="C4C7C5"/>
+              <w:bottom w:val="single" w:sz="6" w:space="0" w:color="C4C7C5"/>
+              <w:right w:val="single" w:sz="6" w:space="0" w:color="C4C7C5"/>
+            </w:tcBorders>
+            <w:tcMar>
+              <w:top w:w="120" w:type="dxa"/>
+              <w:left w:w="180" w:type="dxa"/>
+              <w:bottom w:w="120" w:type="dxa"/>
+              <w:right w:w="180" w:type="dxa"/>
+            </w:tcMar>
+            <w:vAlign w:val="center"/>
+            <w:hideMark/>
+          </w:tcPr>
+          <w:p>
+            <w:r>
+              <w:t>String</w:t>
+            </w:r>
+          </w:p>
+        </w:tc>
+        <w:tc>
+          <w:tcPr>
+            <w:tcW w:w="0" w:type="auto"/>
+            <w:tcBorders>
+              <w:top w:val="single" w:sz="6" w:space="0" w:color="C4C7C5"/>
+              <w:left w:val="single" w:sz="6" w:space="0" w:color="C4C7C5"/>
+              <w:bottom w:val="single" w:sz="6" w:space="0" w:color="C4C7C5"/>
+              <w:right w:val="single" w:sz="6" w:space="0" w:color="C4C7C5"/>
+            </w:tcBorders>
+            <w:tcMar>
+              <w:top w:w="120" w:type="dxa"/>
+              <w:left w:w="180" w:type="dxa"/>
+              <w:bottom w:w="120" w:type="dxa"/>
+              <w:right w:w="180" w:type="dxa"/>
+            </w:tcMar>
+            <w:vAlign w:val="center"/>
+            <w:hideMark/>
+          </w:tcPr>
+          <w:p>
+            <w:r>
+              <w:t>Tag classification (</w:t>
+            </w:r>
+            <w:r>
+              <w:rPr>
+                <w:i/>
+                <w:iCs/>
+              </w:rPr>
+              <w:t>Announcements</w:t>
+            </w:r>
+            <w:r>
+              <w:t xml:space="preserve">, </w:t>
+            </w:r>
+            <w:r>
+              <w:rPr>
+                <w:i/>
+                <w:iCs/>
+              </w:rPr>
+              <w:t>CS/IT</w:t>
+            </w:r>
+            <w:r>
+              <w:t xml:space="preserve">, </w:t>
+            </w:r>
+            <w:r>
+              <w:rPr>
+                <w:i/>
+                <w:iCs/>
+              </w:rPr>
+              <w:t>Lost &amp; Found</w:t>
+            </w:r>
+            <w:r>
+              <w:t xml:space="preserve">, </w:t>
+            </w:r>
+            <w:r>
+              <w:rPr>
+                <w:i/>
+                <w:iCs/>
+              </w:rPr>
+              <w:t>Events</w:t>
+            </w:r>
+            <w:r>
+              <w:t xml:space="preserve">, </w:t>
+            </w:r>
+            <w:r>
+              <w:rPr>
+                <w:i/>
+                <w:iCs/>
+              </w:rPr>
+              <w:t>General</w:t>
+            </w:r>
+            <w:r>
+              <w:t>).</w:t>
+            </w:r>
+          </w:p>
+        </w:tc>
+      </w:tr>
+      <w:tr>
+        <w:trPr>
+          <w:tblCellSpacing w:w="15" w:type="dxa"/>
+        </w:trPr>
+        <w:tc>
+          <w:tcPr>
+            <w:tcW w:w="0" w:type="auto"/>
+            <w:tcBorders>
+              <w:top w:val="single" w:sz="6" w:space="0" w:color="C4C7C5"/>
+              <w:left w:val="single" w:sz="6" w:space="0" w:color="C4C7C5"/>
+              <w:bottom w:val="single" w:sz="6" w:space="0" w:color="C4C7C5"/>
+              <w:right w:val="single" w:sz="6" w:space="0" w:color="C4C7C5"/>
+            </w:tcBorders>
+            <w:tcMar>
+              <w:top w:w="120" w:type="dxa"/>
+              <w:left w:w="180" w:type="dxa"/>
+              <w:bottom w:w="120" w:type="dxa"/>
+              <w:right w:w="180" w:type="dxa"/>
+            </w:tcMar>
+            <w:vAlign w:val="center"/>
+            <w:hideMark/>
+          </w:tcPr>
+          <w:p>
+            <w:r>
+              <w:t>content</w:t>
+            </w:r>
+          </w:p>
+        </w:tc>
+        <w:tc>
+          <w:tcPr>
+            <w:tcW w:w="0" w:type="auto"/>
+            <w:tcBorders>
+              <w:top w:val="single" w:sz="6" w:space="0" w:color="C4C7C5"/>
+              <w:left w:val="single" w:sz="6" w:space="0" w:color="C4C7C5"/>
+              <w:bottom w:val="single" w:sz="6" w:space="0" w:color="C4C7C5"/>
+              <w:right w:val="single" w:sz="6" w:space="0" w:color="C4C7C5"/>
+            </w:tcBorders>
+            <w:tcMar>
+              <w:top w:w="120" w:type="dxa"/>
+              <w:left w:w="180" w:type="dxa"/>
+              <w:bottom w:w="120" w:type="dxa"/>
+              <w:right w:w="180" w:type="dxa"/>
+            </w:tcMar>
+            <w:vAlign w:val="center"/>
+            <w:hideMark/>
+          </w:tcPr>
+          <w:p>
+            <w:r>
+              <w:t>String</w:t>
+            </w:r>
+          </w:p>
+        </w:tc>
+        <w:tc>
+          <w:tcPr>
+            <w:tcW w:w="0" w:type="auto"/>
+            <w:tcBorders>
+              <w:top w:val="single" w:sz="6" w:space="0" w:color="C4C7C5"/>
+              <w:left w:val="single" w:sz="6" w:space="0" w:color="C4C7C5"/>
+              <w:bottom w:val="single" w:sz="6" w:space="0" w:color="C4C7C5"/>
+              <w:right w:val="single" w:sz="6" w:space="0" w:color="C4C7C5"/>
+            </w:tcBorders>
+            <w:tcMar>
+              <w:top w:w="120" w:type="dxa"/>
+              <w:left w:w="180" w:type="dxa"/>
+              <w:bottom w:w="120" w:type="dxa"/>
+              <w:right w:w="180" w:type="dxa"/>
+            </w:tcMar>
+            <w:vAlign w:val="center"/>
+            <w:hideMark/>
+          </w:tcPr>
+          <w:p>
+            <w:r>
+              <w:t>Full message body or announcement description.</w:t>
+            </w:r>
+          </w:p>
+        </w:tc>
+      </w:tr>
+      <w:tr>
+        <w:trPr>
+          <w:tblCellSpacing w:w="15" w:type="dxa"/>
+        </w:trPr>
+        <w:tc>
+          <w:tcPr>
+            <w:tcW w:w="0" w:type="auto"/>
+            <w:tcBorders>
+              <w:top w:val="single" w:sz="6" w:space="0" w:color="C4C7C5"/>
+              <w:left w:val="single" w:sz="6" w:space="0" w:color="C4C7C5"/>
+              <w:bottom w:val="single" w:sz="6" w:space="0" w:color="C4C7C5"/>
+              <w:right w:val="single" w:sz="6" w:space="0" w:color="C4C7C5"/>
+            </w:tcBorders>
+            <w:tcMar>
+              <w:top w:w="120" w:type="dxa"/>
+              <w:left w:w="180" w:type="dxa"/>
+              <w:bottom w:w="120" w:type="dxa"/>
+              <w:right w:w="180" w:type="dxa"/>
+            </w:tcMar>
+            <w:vAlign w:val="center"/>
+            <w:hideMark/>
+          </w:tcPr>
+          <w:p>
+            <w:r>
+              <w:t>author</w:t>
+            </w:r>
+          </w:p>
+        </w:tc>
+        <w:tc>
+          <w:tcPr>
+            <w:tcW w:w="0" w:type="auto"/>
+            <w:tcBorders>
+              <w:top w:val="single" w:sz="6" w:space="0" w:color="C4C7C5"/>
+              <w:left w:val="single" w:sz="6" w:space="0" w:color="C4C7C5"/>
+              <w:bottom w:val="single" w:sz="6" w:space="0" w:color="C4C7C5"/>
+              <w:right w:val="single" w:sz="6" w:space="0" w:color="C4C7C5"/>
+            </w:tcBorders>
+            <w:tcMar>
+              <w:top w:w="120" w:type="dxa"/>
+              <w:left w:w="180" w:type="dxa"/>
+              <w:bottom w:w="120" w:type="dxa"/>
+              <w:right w:w="180" w:type="dxa"/>
+            </w:tcMar>
+            <w:vAlign w:val="center"/>
+            <w:hideMark/>
+          </w:tcPr>
+          <w:p>
+            <w:r>
+              <w:t>String</w:t>
+            </w:r>
+          </w:p>
+        </w:tc>
+        <w:tc>
+          <w:tcPr>
+            <w:tcW w:w="0" w:type="auto"/>
+            <w:tcBorders>
+              <w:top w:val="single" w:sz="6" w:space="0" w:color="C4C7C5"/>
+              <w:left w:val="single" w:sz="6" w:space="0" w:color="C4C7C5"/>
+              <w:bottom w:val="single" w:sz="6" w:space="0" w:color="C4C7C5"/>
+              <w:right w:val="single" w:sz="6" w:space="0" w:color="C4C7C5"/>
+            </w:tcBorders>
+            <w:tcMar>
+              <w:top w:w="120" w:type="dxa"/>
+              <w:left w:w="180" w:type="dxa"/>
+              <w:bottom w:w="120" w:type="dxa"/>
+              <w:right w:w="180" w:type="dxa"/>
+            </w:tcMar>
+            <w:vAlign w:val="center"/>
+            <w:hideMark/>
+          </w:tcPr>
+          <w:p>
+            <w:r>
+              <w:t>Author username or display name.</w:t>
+            </w:r>
+          </w:p>
+        </w:tc>
+      </w:tr>
+      <w:tr>
+        <w:trPr>
+          <w:tblCellSpacing w:w="15" w:type="dxa"/>
+        </w:trPr>
+        <w:tc>
+          <w:tcPr>
+            <w:tcW w:w="0" w:type="auto"/>
+            <w:tcBorders>
+              <w:top w:val="single" w:sz="6" w:space="0" w:color="C4C7C5"/>
+              <w:left w:val="single" w:sz="6" w:space="0" w:color="C4C7C5"/>
+              <w:bottom w:val="single" w:sz="6" w:space="0" w:color="C4C7C5"/>
+              <w:right w:val="single" w:sz="6" w:space="0" w:color="C4C7C5"/>
+            </w:tcBorders>
+            <w:tcMar>
+              <w:top w:w="120" w:type="dxa"/>
+              <w:left w:w="180" w:type="dxa"/>
+              <w:bottom w:w="120" w:type="dxa"/>
+              <w:right w:w="180" w:type="dxa"/>
+            </w:tcMar>
+            <w:vAlign w:val="center"/>
+            <w:hideMark/>
+          </w:tcPr>
+          <w:p>
+            <w:proofErr w:type="spellStart"/>
+            <w:r>
+              <w:t>authorStudentNumber</w:t>
+            </w:r>
+            <w:proofErr w:type="spellEnd"/>
+          </w:p>
+        </w:tc>
+        <w:tc>
+          <w:tcPr>
+            <w:tcW w:w="0" w:type="auto"/>
+            <w:tcBorders>
+              <w:top w:val="single" w:sz="6" w:space="0" w:color="C4C7C5"/>
+              <w:left w:val="single" w:sz="6" w:space="0" w:color="C4C7C5"/>
+              <w:bottom w:val="single" w:sz="6" w:space="0" w:color="C4C7C5"/>
+              <w:right w:val="single" w:sz="6" w:space="0" w:color="C4C7C5"/>
+            </w:tcBorders>
+            <w:tcMar>
+              <w:top w:w="120" w:type="dxa"/>
+              <w:left w:w="180" w:type="dxa"/>
+              <w:bottom w:w="120" w:type="dxa"/>
+              <w:right w:w="180" w:type="dxa"/>
+            </w:tcMar>
+            <w:vAlign w:val="center"/>
+            <w:hideMark/>
+          </w:tcPr>
+          <w:p>
+            <w:r>
+              <w:t>String (FK)</w:t>
+            </w:r>
+          </w:p>
+        </w:tc>
+        <w:tc>
+          <w:tcPr>
+            <w:tcW w:w="0" w:type="auto"/>
+            <w:tcBorders>
+              <w:top w:val="single" w:sz="6" w:space="0" w:color="C4C7C5"/>
+              <w:left w:val="single" w:sz="6" w:space="0" w:color="C4C7C5"/>
+              <w:bottom w:val="single" w:sz="6" w:space="0" w:color="C4C7C5"/>
+              <w:right w:val="single" w:sz="6" w:space="0" w:color="C4C7C5"/>
+            </w:tcBorders>
+            <w:tcMar>
+              <w:top w:w="120" w:type="dxa"/>
+              <w:left w:w="180" w:type="dxa"/>
+              <w:bottom w:w="120" w:type="dxa"/>
+              <w:right w:w="180" w:type="dxa"/>
+            </w:tcMar>
+            <w:vAlign w:val="center"/>
+            <w:hideMark/>
+          </w:tcPr>
+          <w:p>
+            <w:r>
+              <w:t xml:space="preserve">References </w:t>
+            </w:r>
+            <w:proofErr w:type="spellStart"/>
+            <w:proofErr w:type="gramStart"/>
+            <w:r>
+              <w:t>users.studentNumber</w:t>
+            </w:r>
+            <w:proofErr w:type="spellEnd"/>
+            <w:proofErr w:type="gramEnd"/>
+            <w:r>
+              <w:t xml:space="preserve"> for author verification and profile linking.</w:t>
+            </w:r>
+          </w:p>
+        </w:tc>
+      </w:tr>
+      <w:tr>
+        <w:trPr>
+          <w:tblCellSpacing w:w="15" w:type="dxa"/>
+        </w:trPr>
+        <w:tc>
+          <w:tcPr>
+            <w:tcW w:w="0" w:type="auto"/>
+            <w:tcBorders>
+              <w:top w:val="single" w:sz="6" w:space="0" w:color="C4C7C5"/>
+              <w:left w:val="single" w:sz="6" w:space="0" w:color="C4C7C5"/>
+              <w:bottom w:val="single" w:sz="6" w:space="0" w:color="C4C7C5"/>
+              <w:right w:val="single" w:sz="6" w:space="0" w:color="C4C7C5"/>
+            </w:tcBorders>
+            <w:tcMar>
+              <w:top w:w="120" w:type="dxa"/>
+              <w:left w:w="180" w:type="dxa"/>
+              <w:bottom w:w="120" w:type="dxa"/>
+              <w:right w:w="180" w:type="dxa"/>
+            </w:tcMar>
+            <w:vAlign w:val="center"/>
+            <w:hideMark/>
+          </w:tcPr>
+          <w:p>
+            <w:proofErr w:type="spellStart"/>
+            <w:r>
+              <w:t>likesCount</w:t>
+            </w:r>
+            <w:proofErr w:type="spellEnd"/>
+          </w:p>
+        </w:tc>
+        <w:tc>
+          <w:tcPr>
+            <w:tcW w:w="0" w:type="auto"/>
+            <w:tcBorders>
+              <w:top w:val="single" w:sz="6" w:space="0" w:color="C4C7C5"/>
+              <w:left w:val="single" w:sz="6" w:space="0" w:color="C4C7C5"/>
+              <w:bottom w:val="single" w:sz="6" w:space="0" w:color="C4C7C5"/>
+              <w:right w:val="single" w:sz="6" w:space="0" w:color="C4C7C5"/>
+            </w:tcBorders>
+            <w:tcMar>
+              <w:top w:w="120" w:type="dxa"/>
+              <w:left w:w="180" w:type="dxa"/>
+              <w:bottom w:w="120" w:type="dxa"/>
+              <w:right w:w="180" w:type="dxa"/>
+            </w:tcMar>
+            <w:vAlign w:val="center"/>
+            <w:hideMark/>
+          </w:tcPr>
+          <w:p>
+            <w:r>
+              <w:t>Int</w:t>
+            </w:r>
+          </w:p>
+        </w:tc>
+        <w:tc>
+          <w:tcPr>
+            <w:tcW w:w="0" w:type="auto"/>
+            <w:tcBorders>
+              <w:top w:val="single" w:sz="6" w:space="0" w:color="C4C7C5"/>
+              <w:left w:val="single" w:sz="6" w:space="0" w:color="C4C7C5"/>
+              <w:bottom w:val="single" w:sz="6" w:space="0" w:color="C4C7C5"/>
+              <w:right w:val="single" w:sz="6" w:space="0" w:color="C4C7C5"/>
+            </w:tcBorders>
+            <w:tcMar>
+              <w:top w:w="120" w:type="dxa"/>
+              <w:left w:w="180" w:type="dxa"/>
+              <w:bottom w:w="120" w:type="dxa"/>
+              <w:right w:w="180" w:type="dxa"/>
+            </w:tcMar>
+            <w:vAlign w:val="center"/>
+            <w:hideMark/>
+          </w:tcPr>
+          <w:p>
+            <w:r>
+              <w:t>Dynamic aggregate counter tracking post likes.</w:t>
+            </w:r>
+          </w:p>
+        </w:tc>
+      </w:tr>
+      <w:tr>
+        <w:trPr>
+          <w:tblCellSpacing w:w="15" w:type="dxa"/>
+        </w:trPr>
+        <w:tc>
+          <w:tcPr>
+            <w:tcW w:w="0" w:type="auto"/>
+            <w:tcBorders>
+              <w:top w:val="single" w:sz="6" w:space="0" w:color="C4C7C5"/>
+              <w:left w:val="single" w:sz="6" w:space="0" w:color="C4C7C5"/>
+              <w:bottom w:val="single" w:sz="6" w:space="0" w:color="C4C7C5"/>
+              <w:right w:val="single" w:sz="6" w:space="0" w:color="C4C7C5"/>
+            </w:tcBorders>
+            <w:tcMar>
+              <w:top w:w="120" w:type="dxa"/>
+              <w:left w:w="180" w:type="dxa"/>
+              <w:bottom w:w="120" w:type="dxa"/>
+              <w:right w:w="180" w:type="dxa"/>
+            </w:tcMar>
+            <w:vAlign w:val="center"/>
+            <w:hideMark/>
+          </w:tcPr>
+          <w:p>
+            <w:proofErr w:type="spellStart"/>
+            <w:r>
+              <w:t>commentsCount</w:t>
+            </w:r>
+            <w:proofErr w:type="spellEnd"/>
+          </w:p>
+        </w:tc>
+        <w:tc>
+          <w:tcPr>
+            <w:tcW w:w="0" w:type="auto"/>
+            <w:tcBorders>
+              <w:top w:val="single" w:sz="6" w:space="0" w:color="C4C7C5"/>
+              <w:left w:val="single" w:sz="6" w:space="0" w:color="C4C7C5"/>
+              <w:bottom w:val="single" w:sz="6" w:space="0" w:color="C4C7C5"/>
+              <w:right w:val="single" w:sz="6" w:space="0" w:color="C4C7C5"/>
+            </w:tcBorders>
+            <w:tcMar>
+              <w:top w:w="120" w:type="dxa"/>
+              <w:left w:w="180" w:type="dxa"/>
+              <w:bottom w:w="120" w:type="dxa"/>
+              <w:right w:w="180" w:type="dxa"/>
+            </w:tcMar>
+            <w:vAlign w:val="center"/>
+            <w:hideMark/>
+          </w:tcPr>
+          <w:p>
+            <w:r>
+              <w:t>Int</w:t>
+            </w:r>
+          </w:p>
+        </w:tc>
+        <w:tc>
+          <w:tcPr>
+            <w:tcW w:w="0" w:type="auto"/>
+            <w:tcBorders>
+              <w:top w:val="single" w:sz="6" w:space="0" w:color="C4C7C5"/>
+              <w:left w:val="single" w:sz="6" w:space="0" w:color="C4C7C5"/>
+              <w:bottom w:val="single" w:sz="6" w:space="0" w:color="C4C7C5"/>
+              <w:right w:val="single" w:sz="6" w:space="0" w:color="C4C7C5"/>
+            </w:tcBorders>
+            <w:tcMar>
+              <w:top w:w="120" w:type="dxa"/>
+              <w:left w:w="180" w:type="dxa"/>
+              <w:bottom w:w="120" w:type="dxa"/>
+              <w:right w:w="180" w:type="dxa"/>
+            </w:tcMar>
+            <w:vAlign w:val="center"/>
+            <w:hideMark/>
+          </w:tcPr>
+          <w:p>
+            <w:r>
+              <w:t>Dynamic counter tracking child comments.</w:t>
+            </w:r>
+          </w:p>
+        </w:tc>
+      </w:tr>
+      <w:tr>
+        <w:trPr>
+          <w:tblCellSpacing w:w="15" w:type="dxa"/>
+        </w:trPr>
+        <w:tc>
+          <w:tcPr>
+            <w:tcW w:w="0" w:type="auto"/>
+            <w:tcBorders>
+              <w:top w:val="single" w:sz="6" w:space="0" w:color="C4C7C5"/>
+              <w:left w:val="single" w:sz="6" w:space="0" w:color="C4C7C5"/>
+              <w:bottom w:val="single" w:sz="6" w:space="0" w:color="C4C7C5"/>
+              <w:right w:val="single" w:sz="6" w:space="0" w:color="C4C7C5"/>
+            </w:tcBorders>
+            <w:tcMar>
+              <w:top w:w="120" w:type="dxa"/>
+              <w:left w:w="180" w:type="dxa"/>
+              <w:bottom w:w="120" w:type="dxa"/>
+              <w:right w:w="180" w:type="dxa"/>
+            </w:tcMar>
+            <w:vAlign w:val="center"/>
+            <w:hideMark/>
+          </w:tcPr>
+          <w:p>
+            <w:r>
+              <w:t>timestamp</w:t>
+            </w:r>
+          </w:p>
+        </w:tc>
+        <w:tc>
+          <w:tcPr>
+            <w:tcW w:w="0" w:type="auto"/>
+            <w:tcBorders>
+              <w:top w:val="single" w:sz="6" w:space="0" w:color="C4C7C5"/>
+              <w:left w:val="single" w:sz="6" w:space="0" w:color="C4C7C5"/>
+              <w:bottom w:val="single" w:sz="6" w:space="0" w:color="C4C7C5"/>
+              <w:right w:val="single" w:sz="6" w:space="0" w:color="C4C7C5"/>
+            </w:tcBorders>
+            <w:tcMar>
+              <w:top w:w="120" w:type="dxa"/>
+              <w:left w:w="180" w:type="dxa"/>
+              <w:bottom w:w="120" w:type="dxa"/>
+              <w:right w:w="180" w:type="dxa"/>
+            </w:tcMar>
+            <w:vAlign w:val="center"/>
+            <w:hideMark/>
+          </w:tcPr>
+          <w:p>
+            <w:r>
+              <w:t>String</w:t>
+            </w:r>
+          </w:p>
+        </w:tc>
+        <w:tc>
+          <w:tcPr>
+            <w:tcW w:w="0" w:type="auto"/>
+            <w:tcBorders>
+              <w:top w:val="single" w:sz="6" w:space="0" w:color="C4C7C5"/>
+              <w:left w:val="single" w:sz="6" w:space="0" w:color="C4C7C5"/>
+              <w:bottom w:val="single" w:sz="6" w:space="0" w:color="C4C7C5"/>
+              <w:right w:val="single" w:sz="6" w:space="0" w:color="C4C7C5"/>
+            </w:tcBorders>
+            <w:tcMar>
+              <w:top w:w="120" w:type="dxa"/>
+              <w:left w:w="180" w:type="dxa"/>
+              <w:bottom w:w="120" w:type="dxa"/>
+              <w:right w:w="180" w:type="dxa"/>
+            </w:tcMar>
+            <w:vAlign w:val="center"/>
+            <w:hideMark/>
+          </w:tcPr>
+          <w:p>
+            <w:r>
+              <w:t>Creation timestamp or relative time label (e.g., "JUST NOW").</w:t>
+            </w:r>
+          </w:p>
+        </w:tc>
+      </w:tr>
+    </w:tbl>
+    <w:p>
+      <w:pPr>
+        <w:rPr>
+          <w:b/>
+          <w:bCs/>
+        </w:rPr>
+      </w:pPr>
+      <w:r>
+        <w:rPr>
+          <w:b/>
+          <w:bCs/>
+        </w:rPr>
+        <w:t>3. Comment Entity (posts/{</w:t>
       </w:r>
       <w:proofErr w:type="spellStart"/>
       <w:r>
-        <w:t>ViewModel</w:t>
+        <w:rPr>
+          <w:b/>
+          <w:bCs/>
+        </w:rPr>
+        <w:t>postId</w:t>
       </w:r>
       <w:proofErr w:type="spellEnd"/>
       <w:r>
-        <w:t xml:space="preserve"> state collection, instantly making it visible on the feed. </w:t>
+        <w:rPr>
+          <w:b/>
+          <w:bCs/>
+        </w:rPr>
+        <w:t>}/comments Sub-Collection)</w:t>
       </w:r>
     </w:p>
     <w:p>
       <w:pPr>
         <w:numPr>
           <w:ilvl w:val="0"/>
-          <w:numId w:val="7"/>
+          <w:numId w:val="14"/>
         </w:numPr>
       </w:pPr>
       <w:r>
-        <w:lastRenderedPageBreak/>
-        <w:t xml:space="preserve">Read: Queries the observable state to populate the scrollable feed via </w:t>
+        <w:rPr>
+          <w:b/>
+          <w:bCs/>
+        </w:rPr>
+        <w:t>Document ID:</w:t>
+      </w:r>
+      <w:r>
+        <w:t xml:space="preserve"> Auto-generated </w:t>
       </w:r>
       <w:proofErr w:type="spellStart"/>
       <w:r>
-        <w:t>LazyColumn</w:t>
+        <w:t>Firestore</w:t>
       </w:r>
       <w:proofErr w:type="spellEnd"/>
       <w:r>
-        <w:t xml:space="preserve"> and retrieves specific post records by their unique id when navigating to the detail screen. </w:t>
+        <w:t xml:space="preserve"> Document ID</w:t>
+      </w:r>
+    </w:p>
+    <w:tbl>
+      <w:tblPr>
+        <w:tblW w:w="0" w:type="auto"/>
+        <w:tblCellSpacing w:w="15" w:type="dxa"/>
+        <w:tblCellMar>
+          <w:top w:w="15" w:type="dxa"/>
+          <w:left w:w="15" w:type="dxa"/>
+          <w:bottom w:w="15" w:type="dxa"/>
+          <w:right w:w="15" w:type="dxa"/>
+        </w:tblCellMar>
+        <w:tblLook w:val="04A0" w:firstRow="1" w:lastRow="0" w:firstColumn="1" w:lastColumn="0" w:noHBand="0" w:noVBand="1"/>
+      </w:tblPr>
+      <w:tblGrid>
+        <w:gridCol w:w="2591"/>
+        <w:gridCol w:w="1403"/>
+        <w:gridCol w:w="5348"/>
+      </w:tblGrid>
+      <w:tr>
+        <w:trPr>
+          <w:tblHeader/>
+          <w:tblCellSpacing w:w="15" w:type="dxa"/>
+        </w:trPr>
+        <w:tc>
+          <w:tcPr>
+            <w:tcW w:w="0" w:type="auto"/>
+            <w:tcBorders>
+              <w:top w:val="single" w:sz="6" w:space="0" w:color="C4C7C5"/>
+              <w:left w:val="single" w:sz="6" w:space="0" w:color="C4C7C5"/>
+              <w:bottom w:val="single" w:sz="6" w:space="0" w:color="C4C7C5"/>
+              <w:right w:val="single" w:sz="6" w:space="0" w:color="C4C7C5"/>
+            </w:tcBorders>
+            <w:tcMar>
+              <w:top w:w="120" w:type="dxa"/>
+              <w:left w:w="180" w:type="dxa"/>
+              <w:bottom w:w="120" w:type="dxa"/>
+              <w:right w:w="180" w:type="dxa"/>
+            </w:tcMar>
+            <w:vAlign w:val="center"/>
+            <w:hideMark/>
+          </w:tcPr>
+          <w:p>
+            <w:r>
+              <w:rPr>
+                <w:b/>
+                <w:bCs/>
+              </w:rPr>
+              <w:lastRenderedPageBreak/>
+              <w:t>Attribute</w:t>
+            </w:r>
+          </w:p>
+        </w:tc>
+        <w:tc>
+          <w:tcPr>
+            <w:tcW w:w="0" w:type="auto"/>
+            <w:tcBorders>
+              <w:top w:val="single" w:sz="6" w:space="0" w:color="C4C7C5"/>
+              <w:left w:val="single" w:sz="6" w:space="0" w:color="C4C7C5"/>
+              <w:bottom w:val="single" w:sz="6" w:space="0" w:color="C4C7C5"/>
+              <w:right w:val="single" w:sz="6" w:space="0" w:color="C4C7C5"/>
+            </w:tcBorders>
+            <w:tcMar>
+              <w:top w:w="120" w:type="dxa"/>
+              <w:left w:w="180" w:type="dxa"/>
+              <w:bottom w:w="120" w:type="dxa"/>
+              <w:right w:w="180" w:type="dxa"/>
+            </w:tcMar>
+            <w:vAlign w:val="center"/>
+            <w:hideMark/>
+          </w:tcPr>
+          <w:p>
+            <w:r>
+              <w:rPr>
+                <w:b/>
+                <w:bCs/>
+              </w:rPr>
+              <w:t>Data Type</w:t>
+            </w:r>
+          </w:p>
+        </w:tc>
+        <w:tc>
+          <w:tcPr>
+            <w:tcW w:w="0" w:type="auto"/>
+            <w:tcBorders>
+              <w:top w:val="single" w:sz="6" w:space="0" w:color="C4C7C5"/>
+              <w:left w:val="single" w:sz="6" w:space="0" w:color="C4C7C5"/>
+              <w:bottom w:val="single" w:sz="6" w:space="0" w:color="C4C7C5"/>
+              <w:right w:val="single" w:sz="6" w:space="0" w:color="C4C7C5"/>
+            </w:tcBorders>
+            <w:tcMar>
+              <w:top w:w="120" w:type="dxa"/>
+              <w:left w:w="180" w:type="dxa"/>
+              <w:bottom w:w="120" w:type="dxa"/>
+              <w:right w:w="180" w:type="dxa"/>
+            </w:tcMar>
+            <w:vAlign w:val="center"/>
+            <w:hideMark/>
+          </w:tcPr>
+          <w:p>
+            <w:r>
+              <w:rPr>
+                <w:b/>
+                <w:bCs/>
+              </w:rPr>
+              <w:t>Description</w:t>
+            </w:r>
+          </w:p>
+        </w:tc>
+      </w:tr>
+      <w:tr>
+        <w:trPr>
+          <w:tblCellSpacing w:w="15" w:type="dxa"/>
+        </w:trPr>
+        <w:tc>
+          <w:tcPr>
+            <w:tcW w:w="0" w:type="auto"/>
+            <w:tcBorders>
+              <w:top w:val="single" w:sz="6" w:space="0" w:color="C4C7C5"/>
+              <w:left w:val="single" w:sz="6" w:space="0" w:color="C4C7C5"/>
+              <w:bottom w:val="single" w:sz="6" w:space="0" w:color="C4C7C5"/>
+              <w:right w:val="single" w:sz="6" w:space="0" w:color="C4C7C5"/>
+            </w:tcBorders>
+            <w:tcMar>
+              <w:top w:w="120" w:type="dxa"/>
+              <w:left w:w="180" w:type="dxa"/>
+              <w:bottom w:w="120" w:type="dxa"/>
+              <w:right w:w="180" w:type="dxa"/>
+            </w:tcMar>
+            <w:vAlign w:val="center"/>
+            <w:hideMark/>
+          </w:tcPr>
+          <w:p>
+            <w:r>
+              <w:t>id</w:t>
+            </w:r>
+          </w:p>
+        </w:tc>
+        <w:tc>
+          <w:tcPr>
+            <w:tcW w:w="0" w:type="auto"/>
+            <w:tcBorders>
+              <w:top w:val="single" w:sz="6" w:space="0" w:color="C4C7C5"/>
+              <w:left w:val="single" w:sz="6" w:space="0" w:color="C4C7C5"/>
+              <w:bottom w:val="single" w:sz="6" w:space="0" w:color="C4C7C5"/>
+              <w:right w:val="single" w:sz="6" w:space="0" w:color="C4C7C5"/>
+            </w:tcBorders>
+            <w:tcMar>
+              <w:top w:w="120" w:type="dxa"/>
+              <w:left w:w="180" w:type="dxa"/>
+              <w:bottom w:w="120" w:type="dxa"/>
+              <w:right w:w="180" w:type="dxa"/>
+            </w:tcMar>
+            <w:vAlign w:val="center"/>
+            <w:hideMark/>
+          </w:tcPr>
+          <w:p>
+            <w:r>
+              <w:t>String (PK)</w:t>
+            </w:r>
+          </w:p>
+        </w:tc>
+        <w:tc>
+          <w:tcPr>
+            <w:tcW w:w="0" w:type="auto"/>
+            <w:tcBorders>
+              <w:top w:val="single" w:sz="6" w:space="0" w:color="C4C7C5"/>
+              <w:left w:val="single" w:sz="6" w:space="0" w:color="C4C7C5"/>
+              <w:bottom w:val="single" w:sz="6" w:space="0" w:color="C4C7C5"/>
+              <w:right w:val="single" w:sz="6" w:space="0" w:color="C4C7C5"/>
+            </w:tcBorders>
+            <w:tcMar>
+              <w:top w:w="120" w:type="dxa"/>
+              <w:left w:w="180" w:type="dxa"/>
+              <w:bottom w:w="120" w:type="dxa"/>
+              <w:right w:w="180" w:type="dxa"/>
+            </w:tcMar>
+            <w:vAlign w:val="center"/>
+            <w:hideMark/>
+          </w:tcPr>
+          <w:p>
+            <w:r>
+              <w:t>Unique identifier for the individual comment.</w:t>
+            </w:r>
+          </w:p>
+        </w:tc>
+      </w:tr>
+      <w:tr>
+        <w:trPr>
+          <w:tblCellSpacing w:w="15" w:type="dxa"/>
+        </w:trPr>
+        <w:tc>
+          <w:tcPr>
+            <w:tcW w:w="0" w:type="auto"/>
+            <w:tcBorders>
+              <w:top w:val="single" w:sz="6" w:space="0" w:color="C4C7C5"/>
+              <w:left w:val="single" w:sz="6" w:space="0" w:color="C4C7C5"/>
+              <w:bottom w:val="single" w:sz="6" w:space="0" w:color="C4C7C5"/>
+              <w:right w:val="single" w:sz="6" w:space="0" w:color="C4C7C5"/>
+            </w:tcBorders>
+            <w:tcMar>
+              <w:top w:w="120" w:type="dxa"/>
+              <w:left w:w="180" w:type="dxa"/>
+              <w:bottom w:w="120" w:type="dxa"/>
+              <w:right w:w="180" w:type="dxa"/>
+            </w:tcMar>
+            <w:vAlign w:val="center"/>
+            <w:hideMark/>
+          </w:tcPr>
+          <w:p>
+            <w:proofErr w:type="spellStart"/>
+            <w:r>
+              <w:t>postId</w:t>
+            </w:r>
+            <w:proofErr w:type="spellEnd"/>
+          </w:p>
+        </w:tc>
+        <w:tc>
+          <w:tcPr>
+            <w:tcW w:w="0" w:type="auto"/>
+            <w:tcBorders>
+              <w:top w:val="single" w:sz="6" w:space="0" w:color="C4C7C5"/>
+              <w:left w:val="single" w:sz="6" w:space="0" w:color="C4C7C5"/>
+              <w:bottom w:val="single" w:sz="6" w:space="0" w:color="C4C7C5"/>
+              <w:right w:val="single" w:sz="6" w:space="0" w:color="C4C7C5"/>
+            </w:tcBorders>
+            <w:tcMar>
+              <w:top w:w="120" w:type="dxa"/>
+              <w:left w:w="180" w:type="dxa"/>
+              <w:bottom w:w="120" w:type="dxa"/>
+              <w:right w:w="180" w:type="dxa"/>
+            </w:tcMar>
+            <w:vAlign w:val="center"/>
+            <w:hideMark/>
+          </w:tcPr>
+          <w:p>
+            <w:r>
+              <w:t>String (FK)</w:t>
+            </w:r>
+          </w:p>
+        </w:tc>
+        <w:tc>
+          <w:tcPr>
+            <w:tcW w:w="0" w:type="auto"/>
+            <w:tcBorders>
+              <w:top w:val="single" w:sz="6" w:space="0" w:color="C4C7C5"/>
+              <w:left w:val="single" w:sz="6" w:space="0" w:color="C4C7C5"/>
+              <w:bottom w:val="single" w:sz="6" w:space="0" w:color="C4C7C5"/>
+              <w:right w:val="single" w:sz="6" w:space="0" w:color="C4C7C5"/>
+            </w:tcBorders>
+            <w:tcMar>
+              <w:top w:w="120" w:type="dxa"/>
+              <w:left w:w="180" w:type="dxa"/>
+              <w:bottom w:w="120" w:type="dxa"/>
+              <w:right w:w="180" w:type="dxa"/>
+            </w:tcMar>
+            <w:vAlign w:val="center"/>
+            <w:hideMark/>
+          </w:tcPr>
+          <w:p>
+            <w:r>
+              <w:t>References the parent CampusPost.id.</w:t>
+            </w:r>
+          </w:p>
+        </w:tc>
+      </w:tr>
+      <w:tr>
+        <w:trPr>
+          <w:tblCellSpacing w:w="15" w:type="dxa"/>
+        </w:trPr>
+        <w:tc>
+          <w:tcPr>
+            <w:tcW w:w="0" w:type="auto"/>
+            <w:tcBorders>
+              <w:top w:val="single" w:sz="6" w:space="0" w:color="C4C7C5"/>
+              <w:left w:val="single" w:sz="6" w:space="0" w:color="C4C7C5"/>
+              <w:bottom w:val="single" w:sz="6" w:space="0" w:color="C4C7C5"/>
+              <w:right w:val="single" w:sz="6" w:space="0" w:color="C4C7C5"/>
+            </w:tcBorders>
+            <w:tcMar>
+              <w:top w:w="120" w:type="dxa"/>
+              <w:left w:w="180" w:type="dxa"/>
+              <w:bottom w:w="120" w:type="dxa"/>
+              <w:right w:w="180" w:type="dxa"/>
+            </w:tcMar>
+            <w:vAlign w:val="center"/>
+            <w:hideMark/>
+          </w:tcPr>
+          <w:p>
+            <w:r>
+              <w:t>author</w:t>
+            </w:r>
+          </w:p>
+        </w:tc>
+        <w:tc>
+          <w:tcPr>
+            <w:tcW w:w="0" w:type="auto"/>
+            <w:tcBorders>
+              <w:top w:val="single" w:sz="6" w:space="0" w:color="C4C7C5"/>
+              <w:left w:val="single" w:sz="6" w:space="0" w:color="C4C7C5"/>
+              <w:bottom w:val="single" w:sz="6" w:space="0" w:color="C4C7C5"/>
+              <w:right w:val="single" w:sz="6" w:space="0" w:color="C4C7C5"/>
+            </w:tcBorders>
+            <w:tcMar>
+              <w:top w:w="120" w:type="dxa"/>
+              <w:left w:w="180" w:type="dxa"/>
+              <w:bottom w:w="120" w:type="dxa"/>
+              <w:right w:w="180" w:type="dxa"/>
+            </w:tcMar>
+            <w:vAlign w:val="center"/>
+            <w:hideMark/>
+          </w:tcPr>
+          <w:p>
+            <w:r>
+              <w:t>String</w:t>
+            </w:r>
+          </w:p>
+        </w:tc>
+        <w:tc>
+          <w:tcPr>
+            <w:tcW w:w="0" w:type="auto"/>
+            <w:tcBorders>
+              <w:top w:val="single" w:sz="6" w:space="0" w:color="C4C7C5"/>
+              <w:left w:val="single" w:sz="6" w:space="0" w:color="C4C7C5"/>
+              <w:bottom w:val="single" w:sz="6" w:space="0" w:color="C4C7C5"/>
+              <w:right w:val="single" w:sz="6" w:space="0" w:color="C4C7C5"/>
+            </w:tcBorders>
+            <w:tcMar>
+              <w:top w:w="120" w:type="dxa"/>
+              <w:left w:w="180" w:type="dxa"/>
+              <w:bottom w:w="120" w:type="dxa"/>
+              <w:right w:w="180" w:type="dxa"/>
+            </w:tcMar>
+            <w:vAlign w:val="center"/>
+            <w:hideMark/>
+          </w:tcPr>
+          <w:p>
+            <w:r>
+              <w:t>Display name or handle of the commenter.</w:t>
+            </w:r>
+          </w:p>
+        </w:tc>
+      </w:tr>
+      <w:tr>
+        <w:trPr>
+          <w:tblCellSpacing w:w="15" w:type="dxa"/>
+        </w:trPr>
+        <w:tc>
+          <w:tcPr>
+            <w:tcW w:w="0" w:type="auto"/>
+            <w:tcBorders>
+              <w:top w:val="single" w:sz="6" w:space="0" w:color="C4C7C5"/>
+              <w:left w:val="single" w:sz="6" w:space="0" w:color="C4C7C5"/>
+              <w:bottom w:val="single" w:sz="6" w:space="0" w:color="C4C7C5"/>
+              <w:right w:val="single" w:sz="6" w:space="0" w:color="C4C7C5"/>
+            </w:tcBorders>
+            <w:tcMar>
+              <w:top w:w="120" w:type="dxa"/>
+              <w:left w:w="180" w:type="dxa"/>
+              <w:bottom w:w="120" w:type="dxa"/>
+              <w:right w:w="180" w:type="dxa"/>
+            </w:tcMar>
+            <w:vAlign w:val="center"/>
+            <w:hideMark/>
+          </w:tcPr>
+          <w:p>
+            <w:proofErr w:type="spellStart"/>
+            <w:r>
+              <w:t>authorStudentNumber</w:t>
+            </w:r>
+            <w:proofErr w:type="spellEnd"/>
+          </w:p>
+        </w:tc>
+        <w:tc>
+          <w:tcPr>
+            <w:tcW w:w="0" w:type="auto"/>
+            <w:tcBorders>
+              <w:top w:val="single" w:sz="6" w:space="0" w:color="C4C7C5"/>
+              <w:left w:val="single" w:sz="6" w:space="0" w:color="C4C7C5"/>
+              <w:bottom w:val="single" w:sz="6" w:space="0" w:color="C4C7C5"/>
+              <w:right w:val="single" w:sz="6" w:space="0" w:color="C4C7C5"/>
+            </w:tcBorders>
+            <w:tcMar>
+              <w:top w:w="120" w:type="dxa"/>
+              <w:left w:w="180" w:type="dxa"/>
+              <w:bottom w:w="120" w:type="dxa"/>
+              <w:right w:w="180" w:type="dxa"/>
+            </w:tcMar>
+            <w:vAlign w:val="center"/>
+            <w:hideMark/>
+          </w:tcPr>
+          <w:p>
+            <w:r>
+              <w:t>String (FK)</w:t>
+            </w:r>
+          </w:p>
+        </w:tc>
+        <w:tc>
+          <w:tcPr>
+            <w:tcW w:w="0" w:type="auto"/>
+            <w:tcBorders>
+              <w:top w:val="single" w:sz="6" w:space="0" w:color="C4C7C5"/>
+              <w:left w:val="single" w:sz="6" w:space="0" w:color="C4C7C5"/>
+              <w:bottom w:val="single" w:sz="6" w:space="0" w:color="C4C7C5"/>
+              <w:right w:val="single" w:sz="6" w:space="0" w:color="C4C7C5"/>
+            </w:tcBorders>
+            <w:tcMar>
+              <w:top w:w="120" w:type="dxa"/>
+              <w:left w:w="180" w:type="dxa"/>
+              <w:bottom w:w="120" w:type="dxa"/>
+              <w:right w:w="180" w:type="dxa"/>
+            </w:tcMar>
+            <w:vAlign w:val="center"/>
+            <w:hideMark/>
+          </w:tcPr>
+          <w:p>
+            <w:r>
+              <w:t xml:space="preserve">References the commenter's </w:t>
+            </w:r>
+            <w:proofErr w:type="spellStart"/>
+            <w:proofErr w:type="gramStart"/>
+            <w:r>
+              <w:t>users.studentNumber</w:t>
+            </w:r>
+            <w:proofErr w:type="spellEnd"/>
+            <w:proofErr w:type="gramEnd"/>
+            <w:r>
+              <w:t>.</w:t>
+            </w:r>
+          </w:p>
+        </w:tc>
+      </w:tr>
+      <w:tr>
+        <w:trPr>
+          <w:tblCellSpacing w:w="15" w:type="dxa"/>
+        </w:trPr>
+        <w:tc>
+          <w:tcPr>
+            <w:tcW w:w="0" w:type="auto"/>
+            <w:tcBorders>
+              <w:top w:val="single" w:sz="6" w:space="0" w:color="C4C7C5"/>
+              <w:left w:val="single" w:sz="6" w:space="0" w:color="C4C7C5"/>
+              <w:bottom w:val="single" w:sz="6" w:space="0" w:color="C4C7C5"/>
+              <w:right w:val="single" w:sz="6" w:space="0" w:color="C4C7C5"/>
+            </w:tcBorders>
+            <w:tcMar>
+              <w:top w:w="120" w:type="dxa"/>
+              <w:left w:w="180" w:type="dxa"/>
+              <w:bottom w:w="120" w:type="dxa"/>
+              <w:right w:w="180" w:type="dxa"/>
+            </w:tcMar>
+            <w:vAlign w:val="center"/>
+            <w:hideMark/>
+          </w:tcPr>
+          <w:p>
+            <w:r>
+              <w:t>text</w:t>
+            </w:r>
+          </w:p>
+        </w:tc>
+        <w:tc>
+          <w:tcPr>
+            <w:tcW w:w="0" w:type="auto"/>
+            <w:tcBorders>
+              <w:top w:val="single" w:sz="6" w:space="0" w:color="C4C7C5"/>
+              <w:left w:val="single" w:sz="6" w:space="0" w:color="C4C7C5"/>
+              <w:bottom w:val="single" w:sz="6" w:space="0" w:color="C4C7C5"/>
+              <w:right w:val="single" w:sz="6" w:space="0" w:color="C4C7C5"/>
+            </w:tcBorders>
+            <w:tcMar>
+              <w:top w:w="120" w:type="dxa"/>
+              <w:left w:w="180" w:type="dxa"/>
+              <w:bottom w:w="120" w:type="dxa"/>
+              <w:right w:w="180" w:type="dxa"/>
+            </w:tcMar>
+            <w:vAlign w:val="center"/>
+            <w:hideMark/>
+          </w:tcPr>
+          <w:p>
+            <w:r>
+              <w:t>String</w:t>
+            </w:r>
+          </w:p>
+        </w:tc>
+        <w:tc>
+          <w:tcPr>
+            <w:tcW w:w="0" w:type="auto"/>
+            <w:tcBorders>
+              <w:top w:val="single" w:sz="6" w:space="0" w:color="C4C7C5"/>
+              <w:left w:val="single" w:sz="6" w:space="0" w:color="C4C7C5"/>
+              <w:bottom w:val="single" w:sz="6" w:space="0" w:color="C4C7C5"/>
+              <w:right w:val="single" w:sz="6" w:space="0" w:color="C4C7C5"/>
+            </w:tcBorders>
+            <w:tcMar>
+              <w:top w:w="120" w:type="dxa"/>
+              <w:left w:w="180" w:type="dxa"/>
+              <w:bottom w:w="120" w:type="dxa"/>
+              <w:right w:w="180" w:type="dxa"/>
+            </w:tcMar>
+            <w:vAlign w:val="center"/>
+            <w:hideMark/>
+          </w:tcPr>
+          <w:p>
+            <w:r>
+              <w:t>Body text of the comment reply.</w:t>
+            </w:r>
+          </w:p>
+        </w:tc>
+      </w:tr>
+      <w:tr>
+        <w:trPr>
+          <w:tblCellSpacing w:w="15" w:type="dxa"/>
+        </w:trPr>
+        <w:tc>
+          <w:tcPr>
+            <w:tcW w:w="0" w:type="auto"/>
+            <w:tcBorders>
+              <w:top w:val="single" w:sz="6" w:space="0" w:color="C4C7C5"/>
+              <w:left w:val="single" w:sz="6" w:space="0" w:color="C4C7C5"/>
+              <w:bottom w:val="single" w:sz="6" w:space="0" w:color="C4C7C5"/>
+              <w:right w:val="single" w:sz="6" w:space="0" w:color="C4C7C5"/>
+            </w:tcBorders>
+            <w:tcMar>
+              <w:top w:w="120" w:type="dxa"/>
+              <w:left w:w="180" w:type="dxa"/>
+              <w:bottom w:w="120" w:type="dxa"/>
+              <w:right w:w="180" w:type="dxa"/>
+            </w:tcMar>
+            <w:vAlign w:val="center"/>
+            <w:hideMark/>
+          </w:tcPr>
+          <w:p>
+            <w:r>
+              <w:t>timestamp</w:t>
+            </w:r>
+          </w:p>
+        </w:tc>
+        <w:tc>
+          <w:tcPr>
+            <w:tcW w:w="0" w:type="auto"/>
+            <w:tcBorders>
+              <w:top w:val="single" w:sz="6" w:space="0" w:color="C4C7C5"/>
+              <w:left w:val="single" w:sz="6" w:space="0" w:color="C4C7C5"/>
+              <w:bottom w:val="single" w:sz="6" w:space="0" w:color="C4C7C5"/>
+              <w:right w:val="single" w:sz="6" w:space="0" w:color="C4C7C5"/>
+            </w:tcBorders>
+            <w:tcMar>
+              <w:top w:w="120" w:type="dxa"/>
+              <w:left w:w="180" w:type="dxa"/>
+              <w:bottom w:w="120" w:type="dxa"/>
+              <w:right w:w="180" w:type="dxa"/>
+            </w:tcMar>
+            <w:vAlign w:val="center"/>
+            <w:hideMark/>
+          </w:tcPr>
+          <w:p>
+            <w:r>
+              <w:t>String</w:t>
+            </w:r>
+          </w:p>
+        </w:tc>
+        <w:tc>
+          <w:tcPr>
+            <w:tcW w:w="0" w:type="auto"/>
+            <w:tcBorders>
+              <w:top w:val="single" w:sz="6" w:space="0" w:color="C4C7C5"/>
+              <w:left w:val="single" w:sz="6" w:space="0" w:color="C4C7C5"/>
+              <w:bottom w:val="single" w:sz="6" w:space="0" w:color="C4C7C5"/>
+              <w:right w:val="single" w:sz="6" w:space="0" w:color="C4C7C5"/>
+            </w:tcBorders>
+            <w:tcMar>
+              <w:top w:w="120" w:type="dxa"/>
+              <w:left w:w="180" w:type="dxa"/>
+              <w:bottom w:w="120" w:type="dxa"/>
+              <w:right w:w="180" w:type="dxa"/>
+            </w:tcMar>
+            <w:vAlign w:val="center"/>
+            <w:hideMark/>
+          </w:tcPr>
+          <w:p>
+            <w:r>
+              <w:t>Submission timestamp or relative indicator.</w:t>
+            </w:r>
+          </w:p>
+        </w:tc>
+      </w:tr>
+    </w:tbl>
+    <w:p>
+      <w:pPr>
+        <w:rPr>
+          <w:b/>
+          <w:bCs/>
+        </w:rPr>
+      </w:pPr>
+      <w:r>
+        <w:rPr>
+          <w:b/>
+          <w:bCs/>
+        </w:rPr>
+        <w:t>CRUD &amp; State Operations Breakdown</w:t>
       </w:r>
     </w:p>
     <w:p>
       <w:pPr>
         <w:numPr>
           <w:ilvl w:val="0"/>
-          <w:numId w:val="7"/>
+          <w:numId w:val="15"/>
         </w:numPr>
       </w:pPr>
       <w:r>
-        <w:t xml:space="preserve">Update: Identifies an existing post record by its id and modifies its title, category, and content attributes, updating the UI state reactively. </w:t>
+        <w:rPr>
+          <w:b/>
+          <w:bCs/>
+        </w:rPr>
+        <w:t>Create:</w:t>
       </w:r>
     </w:p>
     <w:p>
       <w:pPr>
         <w:numPr>
-          <w:ilvl w:val="0"/>
-          <w:numId w:val="7"/>
+          <w:ilvl w:val="1"/>
+          <w:numId w:val="15"/>
         </w:numPr>
       </w:pPr>
       <w:r>
-        <w:t xml:space="preserve">Delete: Removes a post record matching the target id from the collection, immediately returning the user to the refreshed feed. </w:t>
+        <w:t xml:space="preserve">Registers new student profiles into the </w:t>
+      </w:r>
+      <w:proofErr w:type="gramStart"/>
+      <w:r>
+        <w:t>users</w:t>
+      </w:r>
+      <w:proofErr w:type="gramEnd"/>
+      <w:r>
+        <w:t xml:space="preserve"> collection.</w:t>
       </w:r>
     </w:p>
     <w:p>
-      <w:r>
-        <w:t>VI. Screen Architecture &amp; Navigation Flow</w:t>
+      <w:pPr>
+        <w:numPr>
+          <w:ilvl w:val="1"/>
+          <w:numId w:val="15"/>
+        </w:numPr>
+      </w:pPr>
+      <w:r>
+        <w:t xml:space="preserve">Instantiates a </w:t>
+      </w:r>
+      <w:proofErr w:type="spellStart"/>
+      <w:r>
+        <w:t>CampusPost</w:t>
+      </w:r>
+      <w:proofErr w:type="spellEnd"/>
+      <w:r>
+        <w:t xml:space="preserve"> attributed to </w:t>
+      </w:r>
+      <w:proofErr w:type="spellStart"/>
+      <w:r>
+        <w:t>currentUser.studentNumber</w:t>
+      </w:r>
+      <w:proofErr w:type="spellEnd"/>
+      <w:r>
+        <w:t xml:space="preserve"> and commits it to </w:t>
+      </w:r>
+      <w:proofErr w:type="spellStart"/>
+      <w:r>
+        <w:t>Firestore</w:t>
+      </w:r>
+      <w:proofErr w:type="spellEnd"/>
+      <w:r>
+        <w:t>.</w:t>
       </w:r>
     </w:p>
     <w:p>
       <w:pPr>
         <w:numPr>
-          <w:ilvl w:val="0"/>
-          <w:numId w:val="8"/>
+          <w:ilvl w:val="1"/>
+          <w:numId w:val="15"/>
         </w:numPr>
       </w:pPr>
       <w:r>
-        <w:t>Feed Screen (</w:t>
+        <w:t xml:space="preserve">Adds real-time Comment documents into the post's sub-collection while incrementing </w:t>
       </w:r>
       <w:proofErr w:type="spellStart"/>
       <w:r>
-        <w:t>FeedScreen</w:t>
+        <w:t>commentsCount</w:t>
       </w:r>
       <w:proofErr w:type="spellEnd"/>
       <w:r>
-        <w:t xml:space="preserve">): Main entry point presenting university branding, a category-tagged scrollable </w:t>
-      </w:r>
-      <w:proofErr w:type="spellStart"/>
-      <w:r>
-        <w:t>LazyColumn</w:t>
-      </w:r>
-      <w:proofErr w:type="spellEnd"/>
-      <w:r>
-        <w:t xml:space="preserve"> of community posts, a Floating Action Button (+) to compose a post, and card tap actions linking to detailed post views. </w:t>
+        <w:t>.</w:t>
       </w:r>
     </w:p>
     <w:p>
       <w:pPr>
         <w:numPr>
           <w:ilvl w:val="0"/>
-          <w:numId w:val="8"/>
+          <w:numId w:val="15"/>
         </w:numPr>
       </w:pPr>
       <w:r>
-        <w:t>Post Detail Screen (</w:t>
-      </w:r>
-      <w:proofErr w:type="spellStart"/>
-      <w:r>
-        <w:t>PostDetailScreen</w:t>
-      </w:r>
-      <w:proofErr w:type="spellEnd"/>
-      <w:r>
-        <w:t xml:space="preserve">): Inspector view displaying the complete post body, author information, and action buttons to trigger Edit or Delete operations. </w:t>
+        <w:rPr>
+          <w:b/>
+          <w:bCs/>
+        </w:rPr>
+        <w:t>Read:</w:t>
       </w:r>
     </w:p>
     <w:p>
       <w:pPr>
         <w:numPr>
+          <w:ilvl w:val="1"/>
+          <w:numId w:val="15"/>
+        </w:numPr>
+      </w:pPr>
+      <w:r>
+        <w:t xml:space="preserve">Collects real-time updates of all posts via </w:t>
+      </w:r>
+      <w:proofErr w:type="spellStart"/>
+      <w:r>
+        <w:t>StateFlow</w:t>
+      </w:r>
+      <w:proofErr w:type="spellEnd"/>
+      <w:r>
+        <w:t xml:space="preserve"> to populate the </w:t>
+      </w:r>
+      <w:proofErr w:type="spellStart"/>
+      <w:r>
+        <w:t>FeedScreen</w:t>
+      </w:r>
+      <w:proofErr w:type="spellEnd"/>
+      <w:r>
+        <w:t>.</w:t>
+      </w:r>
+    </w:p>
+    <w:p>
+      <w:pPr>
+        <w:numPr>
+          <w:ilvl w:val="1"/>
+          <w:numId w:val="15"/>
+        </w:numPr>
+      </w:pPr>
+      <w:r>
+        <w:t xml:space="preserve">Queries </w:t>
+      </w:r>
+      <w:proofErr w:type="spellStart"/>
+      <w:r>
+        <w:t>Firestore</w:t>
+      </w:r>
+      <w:proofErr w:type="spellEnd"/>
+      <w:r>
+        <w:t xml:space="preserve"> for author account details when navigating to parameterized profile routes (</w:t>
+      </w:r>
+      <w:proofErr w:type="spellStart"/>
+      <w:r>
+        <w:t>profile?studentNumber</w:t>
+      </w:r>
+      <w:proofErr w:type="spellEnd"/>
+      <w:r>
+        <w:t>={</w:t>
+      </w:r>
+      <w:proofErr w:type="spellStart"/>
+      <w:r>
+        <w:t>studentNumber</w:t>
+      </w:r>
+      <w:proofErr w:type="spellEnd"/>
+      <w:r>
+        <w:t>}).</w:t>
+      </w:r>
+    </w:p>
+    <w:p>
+      <w:pPr>
+        <w:numPr>
+          <w:ilvl w:val="1"/>
+          <w:numId w:val="15"/>
+        </w:numPr>
+      </w:pPr>
+      <w:r>
+        <w:t xml:space="preserve">Establishes real-time listeners for comments within </w:t>
+      </w:r>
+      <w:proofErr w:type="spellStart"/>
+      <w:r>
+        <w:t>PostDetailScreen</w:t>
+      </w:r>
+      <w:proofErr w:type="spellEnd"/>
+      <w:r>
+        <w:t>.</w:t>
+      </w:r>
+    </w:p>
+    <w:p>
+      <w:pPr>
+        <w:numPr>
           <w:ilvl w:val="0"/>
-          <w:numId w:val="8"/>
+          <w:numId w:val="15"/>
         </w:numPr>
       </w:pPr>
       <w:r>
+        <w:rPr>
+          <w:b/>
+          <w:bCs/>
+        </w:rPr>
+        <w:t>Update:</w:t>
+      </w:r>
+    </w:p>
+    <w:p>
+      <w:pPr>
+        <w:numPr>
+          <w:ilvl w:val="1"/>
+          <w:numId w:val="15"/>
+        </w:numPr>
+      </w:pPr>
+      <w:r>
+        <w:t xml:space="preserve">Modifies an existing post's title, category, and body text through </w:t>
+      </w:r>
+      <w:proofErr w:type="spellStart"/>
+      <w:r>
+        <w:t>CreateEditPostScreen</w:t>
+      </w:r>
+      <w:proofErr w:type="spellEnd"/>
+      <w:r>
+        <w:t>.</w:t>
+      </w:r>
+    </w:p>
+    <w:p>
+      <w:pPr>
+        <w:numPr>
+          <w:ilvl w:val="1"/>
+          <w:numId w:val="15"/>
+        </w:numPr>
+      </w:pPr>
+      <w:r>
+        <w:t xml:space="preserve">Dynamically increments or decrements </w:t>
+      </w:r>
+      <w:proofErr w:type="spellStart"/>
+      <w:r>
+        <w:t>likesCount</w:t>
+      </w:r>
+      <w:proofErr w:type="spellEnd"/>
+      <w:r>
+        <w:t xml:space="preserve"> and updates </w:t>
+      </w:r>
+      <w:proofErr w:type="spellStart"/>
+      <w:r>
+        <w:t>commentsCount</w:t>
+      </w:r>
+      <w:proofErr w:type="spellEnd"/>
+      <w:r>
+        <w:t xml:space="preserve"> across </w:t>
+      </w:r>
+      <w:proofErr w:type="spellStart"/>
+      <w:r>
+        <w:t>Firestore</w:t>
+      </w:r>
+      <w:proofErr w:type="spellEnd"/>
+      <w:r>
+        <w:t xml:space="preserve"> and local UI state.</w:t>
+      </w:r>
+    </w:p>
+    <w:p>
+      <w:pPr>
+        <w:numPr>
+          <w:ilvl w:val="0"/>
+          <w:numId w:val="15"/>
+        </w:numPr>
+      </w:pPr>
+      <w:r>
+        <w:rPr>
+          <w:b/>
+          <w:bCs/>
+        </w:rPr>
+        <w:t>Delete:</w:t>
+      </w:r>
+    </w:p>
+    <w:p>
+      <w:pPr>
+        <w:numPr>
+          <w:ilvl w:val="1"/>
+          <w:numId w:val="15"/>
+        </w:numPr>
+      </w:pPr>
+      <w:r>
+        <w:lastRenderedPageBreak/>
+        <w:t xml:space="preserve">Authorizes the original author to purge their post document and its corresponding data from </w:t>
+      </w:r>
+      <w:proofErr w:type="spellStart"/>
+      <w:r>
+        <w:t>Firestore</w:t>
+      </w:r>
+      <w:proofErr w:type="spellEnd"/>
+      <w:r>
+        <w:t>.</w:t>
+      </w:r>
+    </w:p>
+    <w:p>
+      <w:r>
+        <w:t>VI. Screen Architecture &amp; Navigation Flow</w:t>
+      </w:r>
+    </w:p>
+    <w:p>
+      <w:pPr>
+        <w:pStyle w:val="ListParagraph"/>
+        <w:numPr>
+          <w:ilvl w:val="0"/>
+          <w:numId w:val="16"/>
+        </w:numPr>
+      </w:pPr>
+      <w:r>
+        <w:rPr>
+          <w:b/>
+          <w:bCs/>
+        </w:rPr>
+        <w:t>Authentication Screens (</w:t>
+      </w:r>
+      <w:proofErr w:type="spellStart"/>
+      <w:r>
+        <w:rPr>
+          <w:b/>
+          <w:bCs/>
+        </w:rPr>
+        <w:t>LoginScreen</w:t>
+      </w:r>
+      <w:proofErr w:type="spellEnd"/>
+      <w:r>
+        <w:rPr>
+          <w:b/>
+          <w:bCs/>
+        </w:rPr>
+        <w:t xml:space="preserve"> &amp; </w:t>
+      </w:r>
+      <w:proofErr w:type="spellStart"/>
+      <w:r>
+        <w:rPr>
+          <w:b/>
+          <w:bCs/>
+        </w:rPr>
+        <w:t>RegisterScreen</w:t>
+      </w:r>
+      <w:proofErr w:type="spellEnd"/>
+      <w:r>
+        <w:rPr>
+          <w:b/>
+          <w:bCs/>
+        </w:rPr>
+        <w:t>):</w:t>
+      </w:r>
+      <w:r>
+        <w:t xml:space="preserve"> Validates student credentials against </w:t>
+      </w:r>
+      <w:proofErr w:type="spellStart"/>
+      <w:r>
+        <w:t>Firestore</w:t>
+      </w:r>
+      <w:proofErr w:type="spellEnd"/>
+      <w:r>
+        <w:t xml:space="preserve">, binds the authenticated record to </w:t>
+      </w:r>
+      <w:proofErr w:type="spellStart"/>
+      <w:r>
+        <w:t>FeedViewModel.currentUser</w:t>
+      </w:r>
+      <w:proofErr w:type="spellEnd"/>
+      <w:r>
+        <w:t>, and routes directly into the main feed.</w:t>
+      </w:r>
+    </w:p>
+    <w:p>
+      <w:pPr>
+        <w:pStyle w:val="ListParagraph"/>
+        <w:numPr>
+          <w:ilvl w:val="0"/>
+          <w:numId w:val="16"/>
+        </w:numPr>
+      </w:pPr>
+      <w:r>
+        <w:rPr>
+          <w:b/>
+          <w:bCs/>
+        </w:rPr>
+        <w:t>Campus Feed Screen (</w:t>
+      </w:r>
+      <w:proofErr w:type="spellStart"/>
+      <w:r>
+        <w:rPr>
+          <w:b/>
+          <w:bCs/>
+        </w:rPr>
+        <w:t>FeedScreen</w:t>
+      </w:r>
+      <w:proofErr w:type="spellEnd"/>
+      <w:r>
+        <w:rPr>
+          <w:b/>
+          <w:bCs/>
+        </w:rPr>
+        <w:t>):</w:t>
+      </w:r>
+      <w:r>
+        <w:t xml:space="preserve"> The primary community dashboard featuring top Adamson branding, bottom navigation, and a scrollable </w:t>
+      </w:r>
+      <w:proofErr w:type="spellStart"/>
+      <w:r>
+        <w:t>LazyColumn</w:t>
+      </w:r>
+      <w:proofErr w:type="spellEnd"/>
+      <w:r>
+        <w:t xml:space="preserve"> of posts. Users can toggle likes, view engagement metrics, tap cards to open details, tap the author's header to inspect their profile, or hit the compose action to open the post creator.</w:t>
+      </w:r>
+    </w:p>
+    <w:p>
+      <w:pPr>
+        <w:pStyle w:val="ListParagraph"/>
+        <w:numPr>
+          <w:ilvl w:val="0"/>
+          <w:numId w:val="16"/>
+        </w:numPr>
+      </w:pPr>
+      <w:r>
+        <w:rPr>
+          <w:b/>
+          <w:bCs/>
+        </w:rPr>
+        <w:t>Post Detail Screen (</w:t>
+      </w:r>
+      <w:proofErr w:type="spellStart"/>
+      <w:r>
+        <w:rPr>
+          <w:b/>
+          <w:bCs/>
+        </w:rPr>
+        <w:t>PostDetailScreen</w:t>
+      </w:r>
+      <w:proofErr w:type="spellEnd"/>
+      <w:r>
+        <w:rPr>
+          <w:b/>
+          <w:bCs/>
+        </w:rPr>
+        <w:t>):</w:t>
+      </w:r>
+      <w:r>
+        <w:t xml:space="preserve"> Detailed inspector displaying the full post body, author verification tag, and an integrated bottom reply bar. Contains a live-updating comment feed and exposes edit/delete options exclusively to the post's author.</w:t>
+      </w:r>
+    </w:p>
+    <w:p>
+      <w:pPr>
+        <w:pStyle w:val="ListParagraph"/>
+        <w:numPr>
+          <w:ilvl w:val="0"/>
+          <w:numId w:val="16"/>
+        </w:numPr>
+      </w:pPr>
+      <w:r>
+        <w:rPr>
+          <w:b/>
+          <w:bCs/>
+        </w:rPr>
         <w:t>Create / Edit Post Screen (</w:t>
       </w:r>
       <w:proofErr w:type="spellStart"/>
       <w:r>
+        <w:rPr>
+          <w:b/>
+          <w:bCs/>
+        </w:rPr>
         <w:t>CreateEditPostScreen</w:t>
       </w:r>
       <w:proofErr w:type="spellEnd"/>
       <w:r>
-        <w:t xml:space="preserve">): Dual-purpose input form containing text fields for title, category, and body content, handling both new post creation and existing post modifications before saving back to the feed. </w:t>
+        <w:rPr>
+          <w:b/>
+          <w:bCs/>
+        </w:rPr>
+        <w:t>):</w:t>
+      </w:r>
+      <w:r>
+        <w:t xml:space="preserve"> A dual-purpose form equipped with category dropdown menus, title fields, and multi-line content inputs. Handles post creation attributed to the logged-in user, as well as modifications to existing records.</w:t>
+      </w:r>
+    </w:p>
+    <w:p>
+      <w:pPr>
+        <w:pStyle w:val="ListParagraph"/>
+        <w:numPr>
+          <w:ilvl w:val="0"/>
+          <w:numId w:val="16"/>
+        </w:numPr>
+      </w:pPr>
+      <w:r>
+        <w:rPr>
+          <w:b/>
+          <w:bCs/>
+        </w:rPr>
+        <w:t>Profile Screen (</w:t>
+      </w:r>
+      <w:proofErr w:type="spellStart"/>
+      <w:r>
+        <w:rPr>
+          <w:b/>
+          <w:bCs/>
+        </w:rPr>
+        <w:t>ProfileScreen</w:t>
+      </w:r>
+      <w:proofErr w:type="spellEnd"/>
+      <w:r>
+        <w:rPr>
+          <w:b/>
+          <w:bCs/>
+        </w:rPr>
+        <w:t>):</w:t>
+      </w:r>
+      <w:r>
+        <w:t xml:space="preserve"> Accepts an optional </w:t>
+      </w:r>
+      <w:proofErr w:type="spellStart"/>
+      <w:r>
+        <w:t>studentNumber</w:t>
+      </w:r>
+      <w:proofErr w:type="spellEnd"/>
+      <w:r>
+        <w:t xml:space="preserve"> parameter. If viewing another student, it displays their full name, handle, student number, and bio in read-only mode. If viewing the logged-in user's profile, it adds the account logout action to clear the active session.</w:t>
       </w:r>
     </w:p>
     <w:p>
@@ -1037,7 +3058,6 @@
     <w:p/>
     <w:p>
       <w:r>
-        <w:lastRenderedPageBreak/>
         <w:t>ERD:</w:t>
       </w:r>
     </w:p>
@@ -1327,6 +3347,213 @@
       <w:r>
         <w:t xml:space="preserve"> (FK) along with the timestamp it was saved. </w:t>
       </w:r>
+      <w:r>
+        <w:br/>
+      </w:r>
+      <w:r>
+        <w:br/>
+        <w:t>UPDATED ERD:</w:t>
+      </w:r>
+      <w:r>
+        <w:br/>
+      </w:r>
+      <w:r>
+        <w:lastRenderedPageBreak/>
+        <w:br/>
+      </w:r>
+      <w:r>
+        <w:drawing>
+          <wp:inline distT="0" distB="0" distL="0" distR="0" wp14:anchorId="2EE09E72" wp14:editId="18EBD5DB">
+            <wp:extent cx="5943600" cy="3389630"/>
+            <wp:effectExtent l="0" t="0" r="0" b="1270"/>
+            <wp:docPr id="557166075" name="Picture 1"/>
+            <wp:cNvGraphicFramePr>
+              <a:graphicFrameLocks xmlns:a="http://schemas.openxmlformats.org/drawingml/2006/main" noChangeAspect="1"/>
+            </wp:cNvGraphicFramePr>
+            <a:graphic xmlns:a="http://schemas.openxmlformats.org/drawingml/2006/main">
+              <a:graphicData uri="http://schemas.openxmlformats.org/drawingml/2006/picture">
+                <pic:pic xmlns:pic="http://schemas.openxmlformats.org/drawingml/2006/picture">
+                  <pic:nvPicPr>
+                    <pic:cNvPr id="557166075" name=""/>
+                    <pic:cNvPicPr/>
+                  </pic:nvPicPr>
+                  <pic:blipFill>
+                    <a:blip r:embed="rId8"/>
+                    <a:stretch>
+                      <a:fillRect/>
+                    </a:stretch>
+                  </pic:blipFill>
+                  <pic:spPr>
+                    <a:xfrm>
+                      <a:off x="0" y="0"/>
+                      <a:ext cx="5943600" cy="3389630"/>
+                    </a:xfrm>
+                    <a:prstGeom prst="rect">
+                      <a:avLst/>
+                    </a:prstGeom>
+                  </pic:spPr>
+                </pic:pic>
+              </a:graphicData>
+            </a:graphic>
+          </wp:inline>
+        </w:drawing>
+      </w:r>
+    </w:p>
+    <w:p>
+      <w:pPr>
+        <w:ind w:firstLine="720"/>
+        <w:rPr>
+          <w:b/>
+          <w:bCs/>
+        </w:rPr>
+      </w:pPr>
+      <w:r>
+        <w:rPr>
+          <w:b/>
+          <w:bCs/>
+        </w:rPr>
+        <w:t>Relationship Cardinalities</w:t>
+      </w:r>
+    </w:p>
+    <w:p>
+      <w:pPr>
+        <w:numPr>
+          <w:ilvl w:val="0"/>
+          <w:numId w:val="10"/>
+        </w:numPr>
+      </w:pPr>
+      <w:r>
+        <w:rPr>
+          <w:b/>
+          <w:bCs/>
+        </w:rPr>
+        <w:t xml:space="preserve">User to </w:t>
+      </w:r>
+      <w:proofErr w:type="spellStart"/>
+      <w:r>
+        <w:rPr>
+          <w:b/>
+          <w:bCs/>
+        </w:rPr>
+        <w:t>CampusPost</w:t>
+      </w:r>
+      <w:proofErr w:type="spellEnd"/>
+      <w:r>
+        <w:rPr>
+          <w:b/>
+          <w:bCs/>
+        </w:rPr>
+        <w:t xml:space="preserve"> (</w:t>
+      </w:r>
+      <w:proofErr w:type="gramStart"/>
+      <w:r>
+        <w:rPr>
+          <w:b/>
+          <w:bCs/>
+        </w:rPr>
+        <w:t>1 :</w:t>
+      </w:r>
+      <w:proofErr w:type="gramEnd"/>
+      <w:r>
+        <w:rPr>
+          <w:b/>
+          <w:bCs/>
+        </w:rPr>
+        <w:t xml:space="preserve"> N):</w:t>
+      </w:r>
+      <w:r>
+        <w:t xml:space="preserve"> A registered student can author zero or many posts. Each post is linked to exactly one student via </w:t>
+      </w:r>
+      <w:proofErr w:type="spellStart"/>
+      <w:r>
+        <w:t>authorStudentNumber</w:t>
+      </w:r>
+      <w:proofErr w:type="spellEnd"/>
+      <w:r>
+        <w:t>.</w:t>
+      </w:r>
+    </w:p>
+    <w:p>
+      <w:pPr>
+        <w:numPr>
+          <w:ilvl w:val="0"/>
+          <w:numId w:val="10"/>
+        </w:numPr>
+      </w:pPr>
+      <w:r>
+        <w:rPr>
+          <w:b/>
+          <w:bCs/>
+        </w:rPr>
+        <w:t>User to Comment (</w:t>
+      </w:r>
+      <w:proofErr w:type="gramStart"/>
+      <w:r>
+        <w:rPr>
+          <w:b/>
+          <w:bCs/>
+        </w:rPr>
+        <w:t>1 :</w:t>
+      </w:r>
+      <w:proofErr w:type="gramEnd"/>
+      <w:r>
+        <w:rPr>
+          <w:b/>
+          <w:bCs/>
+        </w:rPr>
+        <w:t xml:space="preserve"> N):</w:t>
+      </w:r>
+      <w:r>
+        <w:t xml:space="preserve"> A registered student can publish zero or many comments across different posts.</w:t>
+      </w:r>
+    </w:p>
+    <w:p>
+      <w:pPr>
+        <w:numPr>
+          <w:ilvl w:val="0"/>
+          <w:numId w:val="10"/>
+        </w:numPr>
+      </w:pPr>
+      <w:proofErr w:type="spellStart"/>
+      <w:r>
+        <w:rPr>
+          <w:b/>
+          <w:bCs/>
+        </w:rPr>
+        <w:t>CampusPost</w:t>
+      </w:r>
+      <w:proofErr w:type="spellEnd"/>
+      <w:r>
+        <w:rPr>
+          <w:b/>
+          <w:bCs/>
+        </w:rPr>
+        <w:t xml:space="preserve"> to Comment (</w:t>
+      </w:r>
+      <w:proofErr w:type="gramStart"/>
+      <w:r>
+        <w:rPr>
+          <w:b/>
+          <w:bCs/>
+        </w:rPr>
+        <w:t>1 :</w:t>
+      </w:r>
+      <w:proofErr w:type="gramEnd"/>
+      <w:r>
+        <w:rPr>
+          <w:b/>
+          <w:bCs/>
+        </w:rPr>
+        <w:t xml:space="preserve"> N):</w:t>
+      </w:r>
+      <w:r>
+        <w:t xml:space="preserve"> Each post contains a sub-collection of zero or many persistent comments. Deleting a post removes or disassociates its child comments.</w:t>
+      </w:r>
+    </w:p>
+    <w:p>
+      <w:pPr>
+        <w:ind w:firstLine="720"/>
+      </w:pPr>
     </w:p>
     <w:p>
       <w:pPr>
@@ -1495,6 +3722,155 @@
     </w:lvl>
   </w:abstractNum>
   <w:abstractNum w:abstractNumId="1" w15:restartNumberingAfterBreak="0">
+    <w:nsid w:val="03FD3767"/>
+    <w:multiLevelType w:val="multilevel"/>
+    <w:tmpl w:val="42FE5BF8"/>
+    <w:lvl w:ilvl="0">
+      <w:start w:val="1"/>
+      <w:numFmt w:val="bullet"/>
+      <w:lvlText w:val=""/>
+      <w:lvlJc w:val="left"/>
+      <w:pPr>
+        <w:tabs>
+          <w:tab w:val="num" w:pos="720"/>
+        </w:tabs>
+        <w:ind w:left="720" w:hanging="360"/>
+      </w:pPr>
+      <w:rPr>
+        <w:rFonts w:ascii="Symbol" w:hAnsi="Symbol" w:hint="default"/>
+        <w:sz w:val="20"/>
+      </w:rPr>
+    </w:lvl>
+    <w:lvl w:ilvl="1" w:tentative="1">
+      <w:start w:val="1"/>
+      <w:numFmt w:val="bullet"/>
+      <w:lvlText w:val="o"/>
+      <w:lvlJc w:val="left"/>
+      <w:pPr>
+        <w:tabs>
+          <w:tab w:val="num" w:pos="1440"/>
+        </w:tabs>
+        <w:ind w:left="1440" w:hanging="360"/>
+      </w:pPr>
+      <w:rPr>
+        <w:rFonts w:ascii="Courier New" w:hAnsi="Courier New" w:hint="default"/>
+        <w:sz w:val="20"/>
+      </w:rPr>
+    </w:lvl>
+    <w:lvl w:ilvl="2" w:tentative="1">
+      <w:start w:val="1"/>
+      <w:numFmt w:val="bullet"/>
+      <w:lvlText w:val=""/>
+      <w:lvlJc w:val="left"/>
+      <w:pPr>
+        <w:tabs>
+          <w:tab w:val="num" w:pos="2160"/>
+        </w:tabs>
+        <w:ind w:left="2160" w:hanging="360"/>
+      </w:pPr>
+      <w:rPr>
+        <w:rFonts w:ascii="Wingdings" w:hAnsi="Wingdings" w:hint="default"/>
+        <w:sz w:val="20"/>
+      </w:rPr>
+    </w:lvl>
+    <w:lvl w:ilvl="3" w:tentative="1">
+      <w:start w:val="1"/>
+      <w:numFmt w:val="bullet"/>
+      <w:lvlText w:val=""/>
+      <w:lvlJc w:val="left"/>
+      <w:pPr>
+        <w:tabs>
+          <w:tab w:val="num" w:pos="2880"/>
+        </w:tabs>
+        <w:ind w:left="2880" w:hanging="360"/>
+      </w:pPr>
+      <w:rPr>
+        <w:rFonts w:ascii="Wingdings" w:hAnsi="Wingdings" w:hint="default"/>
+        <w:sz w:val="20"/>
+      </w:rPr>
+    </w:lvl>
+    <w:lvl w:ilvl="4" w:tentative="1">
+      <w:start w:val="1"/>
+      <w:numFmt w:val="bullet"/>
+      <w:lvlText w:val=""/>
+      <w:lvlJc w:val="left"/>
+      <w:pPr>
+        <w:tabs>
+          <w:tab w:val="num" w:pos="3600"/>
+        </w:tabs>
+        <w:ind w:left="3600" w:hanging="360"/>
+      </w:pPr>
+      <w:rPr>
+        <w:rFonts w:ascii="Wingdings" w:hAnsi="Wingdings" w:hint="default"/>
+        <w:sz w:val="20"/>
+      </w:rPr>
+    </w:lvl>
+    <w:lvl w:ilvl="5" w:tentative="1">
+      <w:start w:val="1"/>
+      <w:numFmt w:val="bullet"/>
+      <w:lvlText w:val=""/>
+      <w:lvlJc w:val="left"/>
+      <w:pPr>
+        <w:tabs>
+          <w:tab w:val="num" w:pos="4320"/>
+        </w:tabs>
+        <w:ind w:left="4320" w:hanging="360"/>
+      </w:pPr>
+      <w:rPr>
+        <w:rFonts w:ascii="Wingdings" w:hAnsi="Wingdings" w:hint="default"/>
+        <w:sz w:val="20"/>
+      </w:rPr>
+    </w:lvl>
+    <w:lvl w:ilvl="6" w:tentative="1">
+      <w:start w:val="1"/>
+      <w:numFmt w:val="bullet"/>
+      <w:lvlText w:val=""/>
+      <w:lvlJc w:val="left"/>
+      <w:pPr>
+        <w:tabs>
+          <w:tab w:val="num" w:pos="5040"/>
+        </w:tabs>
+        <w:ind w:left="5040" w:hanging="360"/>
+      </w:pPr>
+      <w:rPr>
+        <w:rFonts w:ascii="Wingdings" w:hAnsi="Wingdings" w:hint="default"/>
+        <w:sz w:val="20"/>
+      </w:rPr>
+    </w:lvl>
+    <w:lvl w:ilvl="7" w:tentative="1">
+      <w:start w:val="1"/>
+      <w:numFmt w:val="bullet"/>
+      <w:lvlText w:val=""/>
+      <w:lvlJc w:val="left"/>
+      <w:pPr>
+        <w:tabs>
+          <w:tab w:val="num" w:pos="5760"/>
+        </w:tabs>
+        <w:ind w:left="5760" w:hanging="360"/>
+      </w:pPr>
+      <w:rPr>
+        <w:rFonts w:ascii="Wingdings" w:hAnsi="Wingdings" w:hint="default"/>
+        <w:sz w:val="20"/>
+      </w:rPr>
+    </w:lvl>
+    <w:lvl w:ilvl="8" w:tentative="1">
+      <w:start w:val="1"/>
+      <w:numFmt w:val="bullet"/>
+      <w:lvlText w:val=""/>
+      <w:lvlJc w:val="left"/>
+      <w:pPr>
+        <w:tabs>
+          <w:tab w:val="num" w:pos="6480"/>
+        </w:tabs>
+        <w:ind w:left="6480" w:hanging="360"/>
+      </w:pPr>
+      <w:rPr>
+        <w:rFonts w:ascii="Wingdings" w:hAnsi="Wingdings" w:hint="default"/>
+        <w:sz w:val="20"/>
+      </w:rPr>
+    </w:lvl>
+  </w:abstractNum>
+  <w:abstractNum w:abstractNumId="2" w15:restartNumberingAfterBreak="0">
     <w:nsid w:val="0BA617CF"/>
     <w:multiLevelType w:val="multilevel"/>
     <w:tmpl w:val="07407D46"/>
@@ -1643,7 +4019,7 @@
       </w:rPr>
     </w:lvl>
   </w:abstractNum>
-  <w:abstractNum w:abstractNumId="2" w15:restartNumberingAfterBreak="0">
+  <w:abstractNum w:abstractNumId="3" w15:restartNumberingAfterBreak="0">
     <w:nsid w:val="10E83F8D"/>
     <w:multiLevelType w:val="multilevel"/>
     <w:tmpl w:val="9F945E4A"/>
@@ -1792,7 +4168,305 @@
       </w:rPr>
     </w:lvl>
   </w:abstractNum>
-  <w:abstractNum w:abstractNumId="3" w15:restartNumberingAfterBreak="0">
+  <w:abstractNum w:abstractNumId="4" w15:restartNumberingAfterBreak="0">
+    <w:nsid w:val="2E937304"/>
+    <w:multiLevelType w:val="multilevel"/>
+    <w:tmpl w:val="70CA89DA"/>
+    <w:lvl w:ilvl="0">
+      <w:start w:val="1"/>
+      <w:numFmt w:val="bullet"/>
+      <w:lvlText w:val=""/>
+      <w:lvlJc w:val="left"/>
+      <w:pPr>
+        <w:tabs>
+          <w:tab w:val="num" w:pos="720"/>
+        </w:tabs>
+        <w:ind w:left="720" w:hanging="360"/>
+      </w:pPr>
+      <w:rPr>
+        <w:rFonts w:ascii="Symbol" w:hAnsi="Symbol" w:hint="default"/>
+        <w:sz w:val="20"/>
+      </w:rPr>
+    </w:lvl>
+    <w:lvl w:ilvl="1" w:tentative="1">
+      <w:start w:val="1"/>
+      <w:numFmt w:val="bullet"/>
+      <w:lvlText w:val="o"/>
+      <w:lvlJc w:val="left"/>
+      <w:pPr>
+        <w:tabs>
+          <w:tab w:val="num" w:pos="1440"/>
+        </w:tabs>
+        <w:ind w:left="1440" w:hanging="360"/>
+      </w:pPr>
+      <w:rPr>
+        <w:rFonts w:ascii="Courier New" w:hAnsi="Courier New" w:hint="default"/>
+        <w:sz w:val="20"/>
+      </w:rPr>
+    </w:lvl>
+    <w:lvl w:ilvl="2" w:tentative="1">
+      <w:start w:val="1"/>
+      <w:numFmt w:val="bullet"/>
+      <w:lvlText w:val=""/>
+      <w:lvlJc w:val="left"/>
+      <w:pPr>
+        <w:tabs>
+          <w:tab w:val="num" w:pos="2160"/>
+        </w:tabs>
+        <w:ind w:left="2160" w:hanging="360"/>
+      </w:pPr>
+      <w:rPr>
+        <w:rFonts w:ascii="Wingdings" w:hAnsi="Wingdings" w:hint="default"/>
+        <w:sz w:val="20"/>
+      </w:rPr>
+    </w:lvl>
+    <w:lvl w:ilvl="3" w:tentative="1">
+      <w:start w:val="1"/>
+      <w:numFmt w:val="bullet"/>
+      <w:lvlText w:val=""/>
+      <w:lvlJc w:val="left"/>
+      <w:pPr>
+        <w:tabs>
+          <w:tab w:val="num" w:pos="2880"/>
+        </w:tabs>
+        <w:ind w:left="2880" w:hanging="360"/>
+      </w:pPr>
+      <w:rPr>
+        <w:rFonts w:ascii="Wingdings" w:hAnsi="Wingdings" w:hint="default"/>
+        <w:sz w:val="20"/>
+      </w:rPr>
+    </w:lvl>
+    <w:lvl w:ilvl="4" w:tentative="1">
+      <w:start w:val="1"/>
+      <w:numFmt w:val="bullet"/>
+      <w:lvlText w:val=""/>
+      <w:lvlJc w:val="left"/>
+      <w:pPr>
+        <w:tabs>
+          <w:tab w:val="num" w:pos="3600"/>
+        </w:tabs>
+        <w:ind w:left="3600" w:hanging="360"/>
+      </w:pPr>
+      <w:rPr>
+        <w:rFonts w:ascii="Wingdings" w:hAnsi="Wingdings" w:hint="default"/>
+        <w:sz w:val="20"/>
+      </w:rPr>
+    </w:lvl>
+    <w:lvl w:ilvl="5" w:tentative="1">
+      <w:start w:val="1"/>
+      <w:numFmt w:val="bullet"/>
+      <w:lvlText w:val=""/>
+      <w:lvlJc w:val="left"/>
+      <w:pPr>
+        <w:tabs>
+          <w:tab w:val="num" w:pos="4320"/>
+        </w:tabs>
+        <w:ind w:left="4320" w:hanging="360"/>
+      </w:pPr>
+      <w:rPr>
+        <w:rFonts w:ascii="Wingdings" w:hAnsi="Wingdings" w:hint="default"/>
+        <w:sz w:val="20"/>
+      </w:rPr>
+    </w:lvl>
+    <w:lvl w:ilvl="6" w:tentative="1">
+      <w:start w:val="1"/>
+      <w:numFmt w:val="bullet"/>
+      <w:lvlText w:val=""/>
+      <w:lvlJc w:val="left"/>
+      <w:pPr>
+        <w:tabs>
+          <w:tab w:val="num" w:pos="5040"/>
+        </w:tabs>
+        <w:ind w:left="5040" w:hanging="360"/>
+      </w:pPr>
+      <w:rPr>
+        <w:rFonts w:ascii="Wingdings" w:hAnsi="Wingdings" w:hint="default"/>
+        <w:sz w:val="20"/>
+      </w:rPr>
+    </w:lvl>
+    <w:lvl w:ilvl="7" w:tentative="1">
+      <w:start w:val="1"/>
+      <w:numFmt w:val="bullet"/>
+      <w:lvlText w:val=""/>
+      <w:lvlJc w:val="left"/>
+      <w:pPr>
+        <w:tabs>
+          <w:tab w:val="num" w:pos="5760"/>
+        </w:tabs>
+        <w:ind w:left="5760" w:hanging="360"/>
+      </w:pPr>
+      <w:rPr>
+        <w:rFonts w:ascii="Wingdings" w:hAnsi="Wingdings" w:hint="default"/>
+        <w:sz w:val="20"/>
+      </w:rPr>
+    </w:lvl>
+    <w:lvl w:ilvl="8" w:tentative="1">
+      <w:start w:val="1"/>
+      <w:numFmt w:val="bullet"/>
+      <w:lvlText w:val=""/>
+      <w:lvlJc w:val="left"/>
+      <w:pPr>
+        <w:tabs>
+          <w:tab w:val="num" w:pos="6480"/>
+        </w:tabs>
+        <w:ind w:left="6480" w:hanging="360"/>
+      </w:pPr>
+      <w:rPr>
+        <w:rFonts w:ascii="Wingdings" w:hAnsi="Wingdings" w:hint="default"/>
+        <w:sz w:val="20"/>
+      </w:rPr>
+    </w:lvl>
+  </w:abstractNum>
+  <w:abstractNum w:abstractNumId="5" w15:restartNumberingAfterBreak="0">
+    <w:nsid w:val="307C471B"/>
+    <w:multiLevelType w:val="multilevel"/>
+    <w:tmpl w:val="1214F1AA"/>
+    <w:lvl w:ilvl="0">
+      <w:start w:val="1"/>
+      <w:numFmt w:val="bullet"/>
+      <w:lvlText w:val=""/>
+      <w:lvlJc w:val="left"/>
+      <w:pPr>
+        <w:tabs>
+          <w:tab w:val="num" w:pos="720"/>
+        </w:tabs>
+        <w:ind w:left="720" w:hanging="360"/>
+      </w:pPr>
+      <w:rPr>
+        <w:rFonts w:ascii="Symbol" w:hAnsi="Symbol" w:hint="default"/>
+        <w:sz w:val="20"/>
+      </w:rPr>
+    </w:lvl>
+    <w:lvl w:ilvl="1" w:tentative="1">
+      <w:start w:val="1"/>
+      <w:numFmt w:val="bullet"/>
+      <w:lvlText w:val="o"/>
+      <w:lvlJc w:val="left"/>
+      <w:pPr>
+        <w:tabs>
+          <w:tab w:val="num" w:pos="1440"/>
+        </w:tabs>
+        <w:ind w:left="1440" w:hanging="360"/>
+      </w:pPr>
+      <w:rPr>
+        <w:rFonts w:ascii="Courier New" w:hAnsi="Courier New" w:hint="default"/>
+        <w:sz w:val="20"/>
+      </w:rPr>
+    </w:lvl>
+    <w:lvl w:ilvl="2" w:tentative="1">
+      <w:start w:val="1"/>
+      <w:numFmt w:val="bullet"/>
+      <w:lvlText w:val=""/>
+      <w:lvlJc w:val="left"/>
+      <w:pPr>
+        <w:tabs>
+          <w:tab w:val="num" w:pos="2160"/>
+        </w:tabs>
+        <w:ind w:left="2160" w:hanging="360"/>
+      </w:pPr>
+      <w:rPr>
+        <w:rFonts w:ascii="Wingdings" w:hAnsi="Wingdings" w:hint="default"/>
+        <w:sz w:val="20"/>
+      </w:rPr>
+    </w:lvl>
+    <w:lvl w:ilvl="3" w:tentative="1">
+      <w:start w:val="1"/>
+      <w:numFmt w:val="bullet"/>
+      <w:lvlText w:val=""/>
+      <w:lvlJc w:val="left"/>
+      <w:pPr>
+        <w:tabs>
+          <w:tab w:val="num" w:pos="2880"/>
+        </w:tabs>
+        <w:ind w:left="2880" w:hanging="360"/>
+      </w:pPr>
+      <w:rPr>
+        <w:rFonts w:ascii="Wingdings" w:hAnsi="Wingdings" w:hint="default"/>
+        <w:sz w:val="20"/>
+      </w:rPr>
+    </w:lvl>
+    <w:lvl w:ilvl="4" w:tentative="1">
+      <w:start w:val="1"/>
+      <w:numFmt w:val="bullet"/>
+      <w:lvlText w:val=""/>
+      <w:lvlJc w:val="left"/>
+      <w:pPr>
+        <w:tabs>
+          <w:tab w:val="num" w:pos="3600"/>
+        </w:tabs>
+        <w:ind w:left="3600" w:hanging="360"/>
+      </w:pPr>
+      <w:rPr>
+        <w:rFonts w:ascii="Wingdings" w:hAnsi="Wingdings" w:hint="default"/>
+        <w:sz w:val="20"/>
+      </w:rPr>
+    </w:lvl>
+    <w:lvl w:ilvl="5" w:tentative="1">
+      <w:start w:val="1"/>
+      <w:numFmt w:val="bullet"/>
+      <w:lvlText w:val=""/>
+      <w:lvlJc w:val="left"/>
+      <w:pPr>
+        <w:tabs>
+          <w:tab w:val="num" w:pos="4320"/>
+        </w:tabs>
+        <w:ind w:left="4320" w:hanging="360"/>
+      </w:pPr>
+      <w:rPr>
+        <w:rFonts w:ascii="Wingdings" w:hAnsi="Wingdings" w:hint="default"/>
+        <w:sz w:val="20"/>
+      </w:rPr>
+    </w:lvl>
+    <w:lvl w:ilvl="6" w:tentative="1">
+      <w:start w:val="1"/>
+      <w:numFmt w:val="bullet"/>
+      <w:lvlText w:val=""/>
+      <w:lvlJc w:val="left"/>
+      <w:pPr>
+        <w:tabs>
+          <w:tab w:val="num" w:pos="5040"/>
+        </w:tabs>
+        <w:ind w:left="5040" w:hanging="360"/>
+      </w:pPr>
+      <w:rPr>
+        <w:rFonts w:ascii="Wingdings" w:hAnsi="Wingdings" w:hint="default"/>
+        <w:sz w:val="20"/>
+      </w:rPr>
+    </w:lvl>
+    <w:lvl w:ilvl="7" w:tentative="1">
+      <w:start w:val="1"/>
+      <w:numFmt w:val="bullet"/>
+      <w:lvlText w:val=""/>
+      <w:lvlJc w:val="left"/>
+      <w:pPr>
+        <w:tabs>
+          <w:tab w:val="num" w:pos="5760"/>
+        </w:tabs>
+        <w:ind w:left="5760" w:hanging="360"/>
+      </w:pPr>
+      <w:rPr>
+        <w:rFonts w:ascii="Wingdings" w:hAnsi="Wingdings" w:hint="default"/>
+        <w:sz w:val="20"/>
+      </w:rPr>
+    </w:lvl>
+    <w:lvl w:ilvl="8" w:tentative="1">
+      <w:start w:val="1"/>
+      <w:numFmt w:val="bullet"/>
+      <w:lvlText w:val=""/>
+      <w:lvlJc w:val="left"/>
+      <w:pPr>
+        <w:tabs>
+          <w:tab w:val="num" w:pos="6480"/>
+        </w:tabs>
+        <w:ind w:left="6480" w:hanging="360"/>
+      </w:pPr>
+      <w:rPr>
+        <w:rFonts w:ascii="Wingdings" w:hAnsi="Wingdings" w:hint="default"/>
+        <w:sz w:val="20"/>
+      </w:rPr>
+    </w:lvl>
+  </w:abstractNum>
+  <w:abstractNum w:abstractNumId="6" w15:restartNumberingAfterBreak="0">
     <w:nsid w:val="3BC70E0E"/>
     <w:multiLevelType w:val="multilevel"/>
     <w:tmpl w:val="D05A98B6"/>
@@ -1941,7 +4615,156 @@
       </w:rPr>
     </w:lvl>
   </w:abstractNum>
-  <w:abstractNum w:abstractNumId="4" w15:restartNumberingAfterBreak="0">
+  <w:abstractNum w:abstractNumId="7" w15:restartNumberingAfterBreak="0">
+    <w:nsid w:val="40DB461D"/>
+    <w:multiLevelType w:val="multilevel"/>
+    <w:tmpl w:val="FF46EEFC"/>
+    <w:lvl w:ilvl="0">
+      <w:start w:val="1"/>
+      <w:numFmt w:val="bullet"/>
+      <w:lvlText w:val=""/>
+      <w:lvlJc w:val="left"/>
+      <w:pPr>
+        <w:tabs>
+          <w:tab w:val="num" w:pos="720"/>
+        </w:tabs>
+        <w:ind w:left="720" w:hanging="360"/>
+      </w:pPr>
+      <w:rPr>
+        <w:rFonts w:ascii="Symbol" w:hAnsi="Symbol" w:hint="default"/>
+        <w:sz w:val="20"/>
+      </w:rPr>
+    </w:lvl>
+    <w:lvl w:ilvl="1">
+      <w:start w:val="1"/>
+      <w:numFmt w:val="bullet"/>
+      <w:lvlText w:val="o"/>
+      <w:lvlJc w:val="left"/>
+      <w:pPr>
+        <w:tabs>
+          <w:tab w:val="num" w:pos="1440"/>
+        </w:tabs>
+        <w:ind w:left="1440" w:hanging="360"/>
+      </w:pPr>
+      <w:rPr>
+        <w:rFonts w:ascii="Courier New" w:hAnsi="Courier New" w:hint="default"/>
+        <w:sz w:val="20"/>
+      </w:rPr>
+    </w:lvl>
+    <w:lvl w:ilvl="2" w:tentative="1">
+      <w:start w:val="1"/>
+      <w:numFmt w:val="bullet"/>
+      <w:lvlText w:val=""/>
+      <w:lvlJc w:val="left"/>
+      <w:pPr>
+        <w:tabs>
+          <w:tab w:val="num" w:pos="2160"/>
+        </w:tabs>
+        <w:ind w:left="2160" w:hanging="360"/>
+      </w:pPr>
+      <w:rPr>
+        <w:rFonts w:ascii="Wingdings" w:hAnsi="Wingdings" w:hint="default"/>
+        <w:sz w:val="20"/>
+      </w:rPr>
+    </w:lvl>
+    <w:lvl w:ilvl="3" w:tentative="1">
+      <w:start w:val="1"/>
+      <w:numFmt w:val="bullet"/>
+      <w:lvlText w:val=""/>
+      <w:lvlJc w:val="left"/>
+      <w:pPr>
+        <w:tabs>
+          <w:tab w:val="num" w:pos="2880"/>
+        </w:tabs>
+        <w:ind w:left="2880" w:hanging="360"/>
+      </w:pPr>
+      <w:rPr>
+        <w:rFonts w:ascii="Wingdings" w:hAnsi="Wingdings" w:hint="default"/>
+        <w:sz w:val="20"/>
+      </w:rPr>
+    </w:lvl>
+    <w:lvl w:ilvl="4" w:tentative="1">
+      <w:start w:val="1"/>
+      <w:numFmt w:val="bullet"/>
+      <w:lvlText w:val=""/>
+      <w:lvlJc w:val="left"/>
+      <w:pPr>
+        <w:tabs>
+          <w:tab w:val="num" w:pos="3600"/>
+        </w:tabs>
+        <w:ind w:left="3600" w:hanging="360"/>
+      </w:pPr>
+      <w:rPr>
+        <w:rFonts w:ascii="Wingdings" w:hAnsi="Wingdings" w:hint="default"/>
+        <w:sz w:val="20"/>
+      </w:rPr>
+    </w:lvl>
+    <w:lvl w:ilvl="5" w:tentative="1">
+      <w:start w:val="1"/>
+      <w:numFmt w:val="bullet"/>
+      <w:lvlText w:val=""/>
+      <w:lvlJc w:val="left"/>
+      <w:pPr>
+        <w:tabs>
+          <w:tab w:val="num" w:pos="4320"/>
+        </w:tabs>
+        <w:ind w:left="4320" w:hanging="360"/>
+      </w:pPr>
+      <w:rPr>
+        <w:rFonts w:ascii="Wingdings" w:hAnsi="Wingdings" w:hint="default"/>
+        <w:sz w:val="20"/>
+      </w:rPr>
+    </w:lvl>
+    <w:lvl w:ilvl="6" w:tentative="1">
+      <w:start w:val="1"/>
+      <w:numFmt w:val="bullet"/>
+      <w:lvlText w:val=""/>
+      <w:lvlJc w:val="left"/>
+      <w:pPr>
+        <w:tabs>
+          <w:tab w:val="num" w:pos="5040"/>
+        </w:tabs>
+        <w:ind w:left="5040" w:hanging="360"/>
+      </w:pPr>
+      <w:rPr>
+        <w:rFonts w:ascii="Wingdings" w:hAnsi="Wingdings" w:hint="default"/>
+        <w:sz w:val="20"/>
+      </w:rPr>
+    </w:lvl>
+    <w:lvl w:ilvl="7" w:tentative="1">
+      <w:start w:val="1"/>
+      <w:numFmt w:val="bullet"/>
+      <w:lvlText w:val=""/>
+      <w:lvlJc w:val="left"/>
+      <w:pPr>
+        <w:tabs>
+          <w:tab w:val="num" w:pos="5760"/>
+        </w:tabs>
+        <w:ind w:left="5760" w:hanging="360"/>
+      </w:pPr>
+      <w:rPr>
+        <w:rFonts w:ascii="Wingdings" w:hAnsi="Wingdings" w:hint="default"/>
+        <w:sz w:val="20"/>
+      </w:rPr>
+    </w:lvl>
+    <w:lvl w:ilvl="8" w:tentative="1">
+      <w:start w:val="1"/>
+      <w:numFmt w:val="bullet"/>
+      <w:lvlText w:val=""/>
+      <w:lvlJc w:val="left"/>
+      <w:pPr>
+        <w:tabs>
+          <w:tab w:val="num" w:pos="6480"/>
+        </w:tabs>
+        <w:ind w:left="6480" w:hanging="360"/>
+      </w:pPr>
+      <w:rPr>
+        <w:rFonts w:ascii="Wingdings" w:hAnsi="Wingdings" w:hint="default"/>
+        <w:sz w:val="20"/>
+      </w:rPr>
+    </w:lvl>
+  </w:abstractNum>
+  <w:abstractNum w:abstractNumId="8" w15:restartNumberingAfterBreak="0">
     <w:nsid w:val="41691B68"/>
     <w:multiLevelType w:val="multilevel"/>
     <w:tmpl w:val="39EC700E"/>
@@ -2090,7 +4913,7 @@
       </w:rPr>
     </w:lvl>
   </w:abstractNum>
-  <w:abstractNum w:abstractNumId="5" w15:restartNumberingAfterBreak="0">
+  <w:abstractNum w:abstractNumId="9" w15:restartNumberingAfterBreak="0">
     <w:nsid w:val="453C473D"/>
     <w:multiLevelType w:val="multilevel"/>
     <w:tmpl w:val="652A64D0"/>
@@ -2239,7 +5062,120 @@
       </w:rPr>
     </w:lvl>
   </w:abstractNum>
-  <w:abstractNum w:abstractNumId="6" w15:restartNumberingAfterBreak="0">
+  <w:abstractNum w:abstractNumId="10" w15:restartNumberingAfterBreak="0">
+    <w:nsid w:val="49B03AAC"/>
+    <w:multiLevelType w:val="hybridMultilevel"/>
+    <w:tmpl w:val="C2604FB6"/>
+    <w:lvl w:ilvl="0" w:tplc="76AAB686">
+      <w:start w:val="4"/>
+      <w:numFmt w:val="bullet"/>
+      <w:lvlText w:val="-"/>
+      <w:lvlJc w:val="left"/>
+      <w:pPr>
+        <w:ind w:left="720" w:hanging="360"/>
+      </w:pPr>
+      <w:rPr>
+        <w:rFonts w:ascii="Aptos" w:eastAsiaTheme="minorHAnsi" w:hAnsi="Aptos" w:cstheme="minorBidi" w:hint="default"/>
+      </w:rPr>
+    </w:lvl>
+    <w:lvl w:ilvl="1" w:tplc="34090003" w:tentative="1">
+      <w:start w:val="1"/>
+      <w:numFmt w:val="bullet"/>
+      <w:lvlText w:val="o"/>
+      <w:lvlJc w:val="left"/>
+      <w:pPr>
+        <w:ind w:left="1440" w:hanging="360"/>
+      </w:pPr>
+      <w:rPr>
+        <w:rFonts w:ascii="Courier New" w:hAnsi="Courier New" w:cs="Courier New" w:hint="default"/>
+      </w:rPr>
+    </w:lvl>
+    <w:lvl w:ilvl="2" w:tplc="34090005" w:tentative="1">
+      <w:start w:val="1"/>
+      <w:numFmt w:val="bullet"/>
+      <w:lvlText w:val=""/>
+      <w:lvlJc w:val="left"/>
+      <w:pPr>
+        <w:ind w:left="2160" w:hanging="360"/>
+      </w:pPr>
+      <w:rPr>
+        <w:rFonts w:ascii="Wingdings" w:hAnsi="Wingdings" w:hint="default"/>
+      </w:rPr>
+    </w:lvl>
+    <w:lvl w:ilvl="3" w:tplc="34090001" w:tentative="1">
+      <w:start w:val="1"/>
+      <w:numFmt w:val="bullet"/>
+      <w:lvlText w:val=""/>
+      <w:lvlJc w:val="left"/>
+      <w:pPr>
+        <w:ind w:left="2880" w:hanging="360"/>
+      </w:pPr>
+      <w:rPr>
+        <w:rFonts w:ascii="Symbol" w:hAnsi="Symbol" w:hint="default"/>
+      </w:rPr>
+    </w:lvl>
+    <w:lvl w:ilvl="4" w:tplc="34090003" w:tentative="1">
+      <w:start w:val="1"/>
+      <w:numFmt w:val="bullet"/>
+      <w:lvlText w:val="o"/>
+      <w:lvlJc w:val="left"/>
+      <w:pPr>
+        <w:ind w:left="3600" w:hanging="360"/>
+      </w:pPr>
+      <w:rPr>
+        <w:rFonts w:ascii="Courier New" w:hAnsi="Courier New" w:cs="Courier New" w:hint="default"/>
+      </w:rPr>
+    </w:lvl>
+    <w:lvl w:ilvl="5" w:tplc="34090005" w:tentative="1">
+      <w:start w:val="1"/>
+      <w:numFmt w:val="bullet"/>
+      <w:lvlText w:val=""/>
+      <w:lvlJc w:val="left"/>
+      <w:pPr>
+        <w:ind w:left="4320" w:hanging="360"/>
+      </w:pPr>
+      <w:rPr>
+        <w:rFonts w:ascii="Wingdings" w:hAnsi="Wingdings" w:hint="default"/>
+      </w:rPr>
+    </w:lvl>
+    <w:lvl w:ilvl="6" w:tplc="34090001" w:tentative="1">
+      <w:start w:val="1"/>
+      <w:numFmt w:val="bullet"/>
+      <w:lvlText w:val=""/>
+      <w:lvlJc w:val="left"/>
+      <w:pPr>
+        <w:ind w:left="5040" w:hanging="360"/>
+      </w:pPr>
+      <w:rPr>
+        <w:rFonts w:ascii="Symbol" w:hAnsi="Symbol" w:hint="default"/>
+      </w:rPr>
+    </w:lvl>
+    <w:lvl w:ilvl="7" w:tplc="34090003" w:tentative="1">
+      <w:start w:val="1"/>
+      <w:numFmt w:val="bullet"/>
+      <w:lvlText w:val="o"/>
+      <w:lvlJc w:val="left"/>
+      <w:pPr>
+        <w:ind w:left="5760" w:hanging="360"/>
+      </w:pPr>
+      <w:rPr>
+        <w:rFonts w:ascii="Courier New" w:hAnsi="Courier New" w:cs="Courier New" w:hint="default"/>
+      </w:rPr>
+    </w:lvl>
+    <w:lvl w:ilvl="8" w:tplc="34090005" w:tentative="1">
+      <w:start w:val="1"/>
+      <w:numFmt w:val="bullet"/>
+      <w:lvlText w:val=""/>
+      <w:lvlJc w:val="left"/>
+      <w:pPr>
+        <w:ind w:left="6480" w:hanging="360"/>
+      </w:pPr>
+      <w:rPr>
+        <w:rFonts w:ascii="Wingdings" w:hAnsi="Wingdings" w:hint="default"/>
+      </w:rPr>
+    </w:lvl>
+  </w:abstractNum>
+  <w:abstractNum w:abstractNumId="11" w15:restartNumberingAfterBreak="0">
     <w:nsid w:val="600C676C"/>
     <w:multiLevelType w:val="multilevel"/>
     <w:tmpl w:val="B2667336"/>
@@ -2352,7 +5288,7 @@
       </w:pPr>
     </w:lvl>
   </w:abstractNum>
-  <w:abstractNum w:abstractNumId="7" w15:restartNumberingAfterBreak="0">
+  <w:abstractNum w:abstractNumId="12" w15:restartNumberingAfterBreak="0">
     <w:nsid w:val="76921A3F"/>
     <w:multiLevelType w:val="multilevel"/>
     <w:tmpl w:val="4F3E6C72"/>
@@ -2465,7 +5401,156 @@
       </w:pPr>
     </w:lvl>
   </w:abstractNum>
-  <w:abstractNum w:abstractNumId="8" w15:restartNumberingAfterBreak="0">
+  <w:abstractNum w:abstractNumId="13" w15:restartNumberingAfterBreak="0">
+    <w:nsid w:val="786C11CC"/>
+    <w:multiLevelType w:val="multilevel"/>
+    <w:tmpl w:val="D26AE192"/>
+    <w:lvl w:ilvl="0">
+      <w:start w:val="1"/>
+      <w:numFmt w:val="bullet"/>
+      <w:lvlText w:val=""/>
+      <w:lvlJc w:val="left"/>
+      <w:pPr>
+        <w:tabs>
+          <w:tab w:val="num" w:pos="720"/>
+        </w:tabs>
+        <w:ind w:left="720" w:hanging="360"/>
+      </w:pPr>
+      <w:rPr>
+        <w:rFonts w:ascii="Symbol" w:hAnsi="Symbol" w:hint="default"/>
+        <w:sz w:val="20"/>
+      </w:rPr>
+    </w:lvl>
+    <w:lvl w:ilvl="1" w:tentative="1">
+      <w:start w:val="1"/>
+      <w:numFmt w:val="bullet"/>
+      <w:lvlText w:val="o"/>
+      <w:lvlJc w:val="left"/>
+      <w:pPr>
+        <w:tabs>
+          <w:tab w:val="num" w:pos="1440"/>
+        </w:tabs>
+        <w:ind w:left="1440" w:hanging="360"/>
+      </w:pPr>
+      <w:rPr>
+        <w:rFonts w:ascii="Courier New" w:hAnsi="Courier New" w:hint="default"/>
+        <w:sz w:val="20"/>
+      </w:rPr>
+    </w:lvl>
+    <w:lvl w:ilvl="2" w:tentative="1">
+      <w:start w:val="1"/>
+      <w:numFmt w:val="bullet"/>
+      <w:lvlText w:val=""/>
+      <w:lvlJc w:val="left"/>
+      <w:pPr>
+        <w:tabs>
+          <w:tab w:val="num" w:pos="2160"/>
+        </w:tabs>
+        <w:ind w:left="2160" w:hanging="360"/>
+      </w:pPr>
+      <w:rPr>
+        <w:rFonts w:ascii="Wingdings" w:hAnsi="Wingdings" w:hint="default"/>
+        <w:sz w:val="20"/>
+      </w:rPr>
+    </w:lvl>
+    <w:lvl w:ilvl="3" w:tentative="1">
+      <w:start w:val="1"/>
+      <w:numFmt w:val="bullet"/>
+      <w:lvlText w:val=""/>
+      <w:lvlJc w:val="left"/>
+      <w:pPr>
+        <w:tabs>
+          <w:tab w:val="num" w:pos="2880"/>
+        </w:tabs>
+        <w:ind w:left="2880" w:hanging="360"/>
+      </w:pPr>
+      <w:rPr>
+        <w:rFonts w:ascii="Wingdings" w:hAnsi="Wingdings" w:hint="default"/>
+        <w:sz w:val="20"/>
+      </w:rPr>
+    </w:lvl>
+    <w:lvl w:ilvl="4" w:tentative="1">
+      <w:start w:val="1"/>
+      <w:numFmt w:val="bullet"/>
+      <w:lvlText w:val=""/>
+      <w:lvlJc w:val="left"/>
+      <w:pPr>
+        <w:tabs>
+          <w:tab w:val="num" w:pos="3600"/>
+        </w:tabs>
+        <w:ind w:left="3600" w:hanging="360"/>
+      </w:pPr>
+      <w:rPr>
+        <w:rFonts w:ascii="Wingdings" w:hAnsi="Wingdings" w:hint="default"/>
+        <w:sz w:val="20"/>
+      </w:rPr>
+    </w:lvl>
+    <w:lvl w:ilvl="5" w:tentative="1">
+      <w:start w:val="1"/>
+      <w:numFmt w:val="bullet"/>
+      <w:lvlText w:val=""/>
+      <w:lvlJc w:val="left"/>
+      <w:pPr>
+        <w:tabs>
+          <w:tab w:val="num" w:pos="4320"/>
+        </w:tabs>
+        <w:ind w:left="4320" w:hanging="360"/>
+      </w:pPr>
+      <w:rPr>
+        <w:rFonts w:ascii="Wingdings" w:hAnsi="Wingdings" w:hint="default"/>
+        <w:sz w:val="20"/>
+      </w:rPr>
+    </w:lvl>
+    <w:lvl w:ilvl="6" w:tentative="1">
+      <w:start w:val="1"/>
+      <w:numFmt w:val="bullet"/>
+      <w:lvlText w:val=""/>
+      <w:lvlJc w:val="left"/>
+      <w:pPr>
+        <w:tabs>
+          <w:tab w:val="num" w:pos="5040"/>
+        </w:tabs>
+        <w:ind w:left="5040" w:hanging="360"/>
+      </w:pPr>
+      <w:rPr>
+        <w:rFonts w:ascii="Wingdings" w:hAnsi="Wingdings" w:hint="default"/>
+        <w:sz w:val="20"/>
+      </w:rPr>
+    </w:lvl>
+    <w:lvl w:ilvl="7" w:tentative="1">
+      <w:start w:val="1"/>
+      <w:numFmt w:val="bullet"/>
+      <w:lvlText w:val=""/>
+      <w:lvlJc w:val="left"/>
+      <w:pPr>
+        <w:tabs>
+          <w:tab w:val="num" w:pos="5760"/>
+        </w:tabs>
+        <w:ind w:left="5760" w:hanging="360"/>
+      </w:pPr>
+      <w:rPr>
+        <w:rFonts w:ascii="Wingdings" w:hAnsi="Wingdings" w:hint="default"/>
+        <w:sz w:val="20"/>
+      </w:rPr>
+    </w:lvl>
+    <w:lvl w:ilvl="8" w:tentative="1">
+      <w:start w:val="1"/>
+      <w:numFmt w:val="bullet"/>
+      <w:lvlText w:val=""/>
+      <w:lvlJc w:val="left"/>
+      <w:pPr>
+        <w:tabs>
+          <w:tab w:val="num" w:pos="6480"/>
+        </w:tabs>
+        <w:ind w:left="6480" w:hanging="360"/>
+      </w:pPr>
+      <w:rPr>
+        <w:rFonts w:ascii="Wingdings" w:hAnsi="Wingdings" w:hint="default"/>
+        <w:sz w:val="20"/>
+      </w:rPr>
+    </w:lvl>
+  </w:abstractNum>
+  <w:abstractNum w:abstractNumId="14" w15:restartNumberingAfterBreak="0">
     <w:nsid w:val="7ABC442B"/>
     <w:multiLevelType w:val="multilevel"/>
     <w:tmpl w:val="DD5A7CE2"/>
@@ -2614,32 +5699,142 @@
       </w:rPr>
     </w:lvl>
   </w:abstractNum>
+  <w:abstractNum w:abstractNumId="15" w15:restartNumberingAfterBreak="0">
+    <w:nsid w:val="7CB74589"/>
+    <w:multiLevelType w:val="hybridMultilevel"/>
+    <w:tmpl w:val="C346EFC2"/>
+    <w:lvl w:ilvl="0" w:tplc="3409000F">
+      <w:start w:val="1"/>
+      <w:numFmt w:val="decimal"/>
+      <w:lvlText w:val="%1."/>
+      <w:lvlJc w:val="left"/>
+      <w:pPr>
+        <w:ind w:left="720" w:hanging="360"/>
+      </w:pPr>
+      <w:rPr>
+        <w:rFonts w:hint="default"/>
+      </w:rPr>
+    </w:lvl>
+    <w:lvl w:ilvl="1" w:tplc="34090019" w:tentative="1">
+      <w:start w:val="1"/>
+      <w:numFmt w:val="lowerLetter"/>
+      <w:lvlText w:val="%2."/>
+      <w:lvlJc w:val="left"/>
+      <w:pPr>
+        <w:ind w:left="1440" w:hanging="360"/>
+      </w:pPr>
+    </w:lvl>
+    <w:lvl w:ilvl="2" w:tplc="3409001B" w:tentative="1">
+      <w:start w:val="1"/>
+      <w:numFmt w:val="lowerRoman"/>
+      <w:lvlText w:val="%3."/>
+      <w:lvlJc w:val="right"/>
+      <w:pPr>
+        <w:ind w:left="2160" w:hanging="180"/>
+      </w:pPr>
+    </w:lvl>
+    <w:lvl w:ilvl="3" w:tplc="3409000F" w:tentative="1">
+      <w:start w:val="1"/>
+      <w:numFmt w:val="decimal"/>
+      <w:lvlText w:val="%4."/>
+      <w:lvlJc w:val="left"/>
+      <w:pPr>
+        <w:ind w:left="2880" w:hanging="360"/>
+      </w:pPr>
+    </w:lvl>
+    <w:lvl w:ilvl="4" w:tplc="34090019" w:tentative="1">
+      <w:start w:val="1"/>
+      <w:numFmt w:val="lowerLetter"/>
+      <w:lvlText w:val="%5."/>
+      <w:lvlJc w:val="left"/>
+      <w:pPr>
+        <w:ind w:left="3600" w:hanging="360"/>
+      </w:pPr>
+    </w:lvl>
+    <w:lvl w:ilvl="5" w:tplc="3409001B" w:tentative="1">
+      <w:start w:val="1"/>
+      <w:numFmt w:val="lowerRoman"/>
+      <w:lvlText w:val="%6."/>
+      <w:lvlJc w:val="right"/>
+      <w:pPr>
+        <w:ind w:left="4320" w:hanging="180"/>
+      </w:pPr>
+    </w:lvl>
+    <w:lvl w:ilvl="6" w:tplc="3409000F" w:tentative="1">
+      <w:start w:val="1"/>
+      <w:numFmt w:val="decimal"/>
+      <w:lvlText w:val="%7."/>
+      <w:lvlJc w:val="left"/>
+      <w:pPr>
+        <w:ind w:left="5040" w:hanging="360"/>
+      </w:pPr>
+    </w:lvl>
+    <w:lvl w:ilvl="7" w:tplc="34090019" w:tentative="1">
+      <w:start w:val="1"/>
+      <w:numFmt w:val="lowerLetter"/>
+      <w:lvlText w:val="%8."/>
+      <w:lvlJc w:val="left"/>
+      <w:pPr>
+        <w:ind w:left="5760" w:hanging="360"/>
+      </w:pPr>
+    </w:lvl>
+    <w:lvl w:ilvl="8" w:tplc="3409001B" w:tentative="1">
+      <w:start w:val="1"/>
+      <w:numFmt w:val="lowerRoman"/>
+      <w:lvlText w:val="%9."/>
+      <w:lvlJc w:val="right"/>
+      <w:pPr>
+        <w:ind w:left="6480" w:hanging="180"/>
+      </w:pPr>
+    </w:lvl>
+  </w:abstractNum>
   <w:num w:numId="1" w16cid:durableId="2011248910">
-    <w:abstractNumId w:val="3"/>
+    <w:abstractNumId w:val="6"/>
   </w:num>
   <w:num w:numId="2" w16cid:durableId="807821649">
     <w:abstractNumId w:val="0"/>
   </w:num>
   <w:num w:numId="3" w16cid:durableId="143081761">
+    <w:abstractNumId w:val="9"/>
+  </w:num>
+  <w:num w:numId="4" w16cid:durableId="991715594">
+    <w:abstractNumId w:val="11"/>
+  </w:num>
+  <w:num w:numId="5" w16cid:durableId="962225291">
+    <w:abstractNumId w:val="2"/>
+  </w:num>
+  <w:num w:numId="6" w16cid:durableId="696271046">
+    <w:abstractNumId w:val="14"/>
+  </w:num>
+  <w:num w:numId="7" w16cid:durableId="1771662205">
+    <w:abstractNumId w:val="3"/>
+  </w:num>
+  <w:num w:numId="8" w16cid:durableId="1451170301">
+    <w:abstractNumId w:val="12"/>
+  </w:num>
+  <w:num w:numId="9" w16cid:durableId="867378655">
+    <w:abstractNumId w:val="8"/>
+  </w:num>
+  <w:num w:numId="10" w16cid:durableId="740755150">
+    <w:abstractNumId w:val="13"/>
+  </w:num>
+  <w:num w:numId="11" w16cid:durableId="1215198253">
+    <w:abstractNumId w:val="10"/>
+  </w:num>
+  <w:num w:numId="12" w16cid:durableId="1990401690">
+    <w:abstractNumId w:val="4"/>
+  </w:num>
+  <w:num w:numId="13" w16cid:durableId="1721513500">
+    <w:abstractNumId w:val="1"/>
+  </w:num>
+  <w:num w:numId="14" w16cid:durableId="1427649598">
     <w:abstractNumId w:val="5"/>
   </w:num>
-  <w:num w:numId="4" w16cid:durableId="991715594">
-    <w:abstractNumId w:val="6"/>
-  </w:num>
-  <w:num w:numId="5" w16cid:durableId="962225291">
-    <w:abstractNumId w:val="1"/>
-  </w:num>
-  <w:num w:numId="6" w16cid:durableId="696271046">
-    <w:abstractNumId w:val="8"/>
-  </w:num>
-  <w:num w:numId="7" w16cid:durableId="1771662205">
-    <w:abstractNumId w:val="2"/>
-  </w:num>
-  <w:num w:numId="8" w16cid:durableId="1451170301">
+  <w:num w:numId="15" w16cid:durableId="1886601239">
     <w:abstractNumId w:val="7"/>
   </w:num>
-  <w:num w:numId="9" w16cid:durableId="867378655">
-    <w:abstractNumId w:val="4"/>
+  <w:num w:numId="16" w16cid:durableId="2066681058">
+    <w:abstractNumId w:val="15"/>
   </w:num>
 </w:numbering>
 </file>

</xml_diff>